<commit_message>
docs(guide): expand section 4 (order & documents) with detailed step-by-step
Section 4 split into 4.1–4.7: create order, and for each document (báo giá,
hợp đồng, tạm ứng, bàn giao, thanh toán cuối) — where to click, what to fill,
edit, approve/sign/confirm, and print/download (PDF/DOCX). +13 new step
screenshots (create forms from a fresh order, view/approve pages, print modal).
docx regenerated (38 images).

Co-Authored-By: Claude Opus 4.8 <noreply@anthropic.com>
</commit_message>
<xml_diff>
--- a/docs/user-guide/HUONG-DAN-SU-DUNG.docx
+++ b/docs/user-guide/HUONG-DAN-SU-DUNG.docx
@@ -943,13 +943,13 @@
       </w:r>
     </w:p>
     <w:bookmarkEnd w:id="30"/>
-    <w:bookmarkStart w:id="37" w:name="đơn-hàng-vòng-đời-chứng-từ"/>
+    <w:bookmarkStart w:id="80" w:name="đơn-hàng-vòng-đời-chứng-từ-chi-tiết"/>
     <w:p>
       <w:pPr>
         <w:pStyle w:val="Heading1"/>
       </w:pPr>
       <w:r>
-        <w:t xml:space="preserve">4. Đơn hàng &amp; vòng đời chứng từ</w:t>
+        <w:t xml:space="preserve">4. Đơn hàng &amp; vòng đời chứng từ (chi tiết)</w:t>
       </w:r>
     </w:p>
     <w:p>
@@ -957,18 +957,151 @@
         <w:pStyle w:val="FirstParagraph"/>
       </w:pPr>
       <w:r>
-        <w:t xml:space="preserve">Đơn hàng là trung tâm — mọi chứng từ (báo giá, hợp đồng, bàn giao, thanh toán) đều gắn với</w:t>
-      </w:r>
-      <w:r>
-        <w:t xml:space="preserve"> </w:t>
-      </w:r>
-      <w:r>
-        <w:t xml:space="preserve">một đơn hàng.</w:t>
-      </w:r>
-    </w:p>
-    <w:p>
-      <w:pPr>
-        <w:pStyle w:val="BodyText"/>
+        <w:t xml:space="preserve">Đơn hàng là</w:t>
+      </w:r>
+      <w:r>
+        <w:t xml:space="preserve"> </w:t>
+      </w:r>
+      <w:r>
+        <w:rPr>
+          <w:b/>
+          <w:bCs/>
+        </w:rPr>
+        <w:t xml:space="preserve">trung tâm</w:t>
+      </w:r>
+      <w:r>
+        <w:t xml:space="preserve"> </w:t>
+      </w:r>
+      <w:r>
+        <w:t xml:space="preserve">của phần mềm. Mọi chứng từ đều gắn với một đơn hàng và đi theo</w:t>
+      </w:r>
+      <w:r>
+        <w:t xml:space="preserve"> </w:t>
+      </w:r>
+      <w:r>
+        <w:rPr>
+          <w:b/>
+          <w:bCs/>
+        </w:rPr>
+        <w:t xml:space="preserve">trình tự bắt buộc</w:t>
+      </w:r>
+      <w:r>
+        <w:t xml:space="preserve">:</w:t>
+      </w:r>
+    </w:p>
+    <w:p>
+      <w:pPr>
+        <w:pStyle w:val="BlockText"/>
+      </w:pPr>
+      <w:r>
+        <w:rPr>
+          <w:b/>
+          <w:bCs/>
+        </w:rPr>
+        <w:t xml:space="preserve">Tạo đơn hàng → Báo giá (duyệt) → Hợp đồng (ký) → Tạm ứng (xác nhận) → Biên bản bàn</w:t>
+      </w:r>
+      <w:r>
+        <w:rPr>
+          <w:b/>
+          <w:bCs/>
+        </w:rPr>
+        <w:t xml:space="preserve"> </w:t>
+      </w:r>
+      <w:r>
+        <w:rPr>
+          <w:b/>
+          <w:bCs/>
+        </w:rPr>
+        <w:t xml:space="preserve">giao (xác nhận) → Thanh toán cuối (xác nhận) → Hoàn tất.</w:t>
+      </w:r>
+    </w:p>
+    <w:p>
+      <w:pPr>
+        <w:pStyle w:val="FirstParagraph"/>
+      </w:pPr>
+      <w:r>
+        <w:t xml:space="preserve">Ở mỗi bước, phần mềm</w:t>
+      </w:r>
+      <w:r>
+        <w:t xml:space="preserve"> </w:t>
+      </w:r>
+      <w:r>
+        <w:rPr>
+          <w:b/>
+          <w:bCs/>
+        </w:rPr>
+        <w:t xml:space="preserve">chỉ mở khóa bước kế tiếp</w:t>
+      </w:r>
+      <w:r>
+        <w:t xml:space="preserve"> </w:t>
+      </w:r>
+      <w:r>
+        <w:t xml:space="preserve">khi bước trước đã hoàn tất (ví dụ: phải</w:t>
+      </w:r>
+      <w:r>
+        <w:t xml:space="preserve"> </w:t>
+      </w:r>
+      <w:r>
+        <w:rPr>
+          <w:b/>
+          <w:bCs/>
+        </w:rPr>
+        <w:t xml:space="preserve">duyệt báo giá</w:t>
+      </w:r>
+      <w:r>
+        <w:t xml:space="preserve"> </w:t>
+      </w:r>
+      <w:r>
+        <w:t xml:space="preserve">mới nên lập hợp đồng; phải</w:t>
+      </w:r>
+      <w:r>
+        <w:t xml:space="preserve"> </w:t>
+      </w:r>
+      <w:r>
+        <w:rPr>
+          <w:b/>
+          <w:bCs/>
+        </w:rPr>
+        <w:t xml:space="preserve">ký hợp đồng</w:t>
+      </w:r>
+      <w:r>
+        <w:t xml:space="preserve"> </w:t>
+      </w:r>
+      <w:r>
+        <w:t xml:space="preserve">mới lập được phiếu tạm ứng…).</w:t>
+      </w:r>
+      <w:r>
+        <w:t xml:space="preserve"> </w:t>
+      </w:r>
+      <w:r>
+        <w:t xml:space="preserve">Phần dưới hướng dẫn</w:t>
+      </w:r>
+      <w:r>
+        <w:t xml:space="preserve"> </w:t>
+      </w:r>
+      <w:r>
+        <w:rPr>
+          <w:b/>
+          <w:bCs/>
+        </w:rPr>
+        <w:t xml:space="preserve">từng chứng từ, từng nút bấm</w:t>
+      </w:r>
+      <w:r>
+        <w:t xml:space="preserve">.</w:t>
+      </w:r>
+    </w:p>
+    <w:bookmarkStart w:id="40" w:name="cách-tạo-đơn-hàng"/>
+    <w:p>
+      <w:pPr>
+        <w:pStyle w:val="Heading2"/>
+      </w:pPr>
+      <w:r>
+        <w:t xml:space="preserve">4.1. Cách tạo đơn hàng</w:t>
+      </w:r>
+    </w:p>
+    <w:p>
+      <w:pPr>
+        <w:pStyle w:val="FirstParagraph"/>
       </w:pPr>
       <w:r>
         <w:rPr>
@@ -997,7 +1130,37 @@
         <w:t xml:space="preserve"> </w:t>
       </w:r>
       <w:r>
-        <w:t xml:space="preserve">để xem danh sách.</w:t>
+        <w:t xml:space="preserve">trên thanh trên cùng để xem danh sách. Bấm nút</w:t>
+      </w:r>
+      <w:r>
+        <w:t xml:space="preserve"> </w:t>
+      </w:r>
+      <w:r>
+        <w:rPr>
+          <w:b/>
+          <w:bCs/>
+        </w:rPr>
+        <w:t xml:space="preserve">+ Tạo</w:t>
+      </w:r>
+      <w:r>
+        <w:rPr>
+          <w:b/>
+          <w:bCs/>
+        </w:rPr>
+        <w:t xml:space="preserve"> </w:t>
+      </w:r>
+      <w:r>
+        <w:rPr>
+          <w:b/>
+          <w:bCs/>
+        </w:rPr>
+        <w:t xml:space="preserve">Đơn Hàng</w:t>
+      </w:r>
+      <w:r>
+        <w:t xml:space="preserve"> </w:t>
+      </w:r>
+      <w:r>
+        <w:t xml:space="preserve">(góc trên bên phải).</w:t>
       </w:r>
     </w:p>
     <w:p>
@@ -1009,7 +1172,7 @@
           <wp:inline>
             <wp:extent cx="5334000" cy="3381904"/>
             <wp:effectExtent b="0" l="0" r="0" t="0"/>
-            <wp:docPr descr="Danh sách đơn hàng" title="" id="32" name="Picture"/>
+            <wp:docPr descr="Danh sách đơn hàng — nút Tạo Đơn Hàng" title="" id="32" name="Picture"/>
             <a:graphic>
               <a:graphicData uri="http://schemas.openxmlformats.org/drawingml/2006/picture">
                 <pic:pic>
@@ -1052,7 +1215,7 @@
         <w:pStyle w:val="ImageCaption"/>
       </w:pPr>
       <w:r>
-        <w:t xml:space="preserve">Danh sách đơn hàng</w:t>
+        <w:t xml:space="preserve">Danh sách đơn hàng — nút Tạo Đơn Hàng</w:t>
       </w:r>
     </w:p>
     <w:p>
@@ -1070,299 +1233,88 @@
         <w:t xml:space="preserve"> </w:t>
       </w:r>
       <w:r>
-        <w:t xml:space="preserve">Bấm vào một đơn để xem</w:t>
-      </w:r>
-      <w:r>
-        <w:t xml:space="preserve"> </w:t>
-      </w:r>
-      <w:r>
-        <w:rPr>
-          <w:b/>
-          <w:bCs/>
-        </w:rPr>
-        <w:t xml:space="preserve">chi tiết</w:t>
-      </w:r>
-      <w:r>
-        <w:t xml:space="preserve">. Màn hình chi tiết thể hiện</w:t>
-      </w:r>
-      <w:r>
-        <w:t xml:space="preserve"> </w:t>
-      </w:r>
-      <w:r>
-        <w:rPr>
-          <w:b/>
-          <w:bCs/>
-        </w:rPr>
-        <w:t xml:space="preserve">tiến trình</w:t>
-      </w:r>
-      <w:r>
-        <w:rPr>
-          <w:b/>
-          <w:bCs/>
-        </w:rPr>
-        <w:t xml:space="preserve"> </w:t>
-      </w:r>
-      <w:r>
-        <w:rPr>
-          <w:b/>
-          <w:bCs/>
-        </w:rPr>
-        <w:t xml:space="preserve">đơn hàng</w:t>
-      </w:r>
-      <w:r>
-        <w:t xml:space="preserve"> </w:t>
-      </w:r>
-      <w:r>
-        <w:t xml:space="preserve">theo thứ tự và trạng thái từng bước:</w:t>
-      </w:r>
-    </w:p>
-    <w:p>
-      <w:pPr>
-        <w:pStyle w:val="Compact"/>
-        <w:numPr>
-          <w:ilvl w:val="0"/>
-          <w:numId w:val="1001"/>
-        </w:numPr>
-      </w:pPr>
-      <w:r>
-        <w:rPr>
-          <w:b/>
-          <w:bCs/>
-        </w:rPr>
-        <w:t xml:space="preserve">Báo giá</w:t>
-      </w:r>
-      <w:r>
-        <w:t xml:space="preserve"> </w:t>
-      </w:r>
-      <w:r>
-        <w:t xml:space="preserve">→</w:t>
-      </w:r>
-      <w:r>
-        <w:t xml:space="preserve"> </w:t>
-      </w:r>
-      <w:r>
-        <w:rPr>
-          <w:i/>
-          <w:iCs/>
-        </w:rPr>
-        <w:t xml:space="preserve">Đã duyệt</w:t>
-      </w:r>
-    </w:p>
-    <w:p>
-      <w:pPr>
-        <w:pStyle w:val="Compact"/>
-        <w:numPr>
-          <w:ilvl w:val="0"/>
-          <w:numId w:val="1001"/>
-        </w:numPr>
-      </w:pPr>
-      <w:r>
-        <w:rPr>
-          <w:b/>
-          <w:bCs/>
-        </w:rPr>
-        <w:t xml:space="preserve">Hợp đồng</w:t>
-      </w:r>
-      <w:r>
-        <w:t xml:space="preserve"> </w:t>
-      </w:r>
-      <w:r>
-        <w:t xml:space="preserve">→</w:t>
-      </w:r>
-      <w:r>
-        <w:t xml:space="preserve"> </w:t>
-      </w:r>
-      <w:r>
-        <w:rPr>
-          <w:i/>
-          <w:iCs/>
-        </w:rPr>
-        <w:t xml:space="preserve">Đã ký</w:t>
-      </w:r>
-      <w:r>
-        <w:t xml:space="preserve"> </w:t>
-      </w:r>
-      <w:r>
-        <w:t xml:space="preserve">(khi ký, phần mềm tự tạo</w:t>
-      </w:r>
-      <w:r>
-        <w:t xml:space="preserve"> </w:t>
-      </w:r>
-      <w:r>
-        <w:rPr>
-          <w:b/>
-          <w:bCs/>
-        </w:rPr>
-        <w:t xml:space="preserve">Kế hoạch sản xuất</w:t>
-      </w:r>
-      <w:r>
-        <w:t xml:space="preserve">)</w:t>
-      </w:r>
-    </w:p>
-    <w:p>
-      <w:pPr>
-        <w:pStyle w:val="Compact"/>
-        <w:numPr>
-          <w:ilvl w:val="0"/>
-          <w:numId w:val="1001"/>
-        </w:numPr>
-      </w:pPr>
-      <w:r>
-        <w:rPr>
-          <w:b/>
-          <w:bCs/>
-        </w:rPr>
-        <w:t xml:space="preserve">Tạm ứng</w:t>
-      </w:r>
-      <w:r>
-        <w:t xml:space="preserve"> </w:t>
-      </w:r>
-      <w:r>
-        <w:t xml:space="preserve">→</w:t>
-      </w:r>
-      <w:r>
-        <w:t xml:space="preserve"> </w:t>
-      </w:r>
-      <w:r>
-        <w:rPr>
-          <w:i/>
-          <w:iCs/>
-        </w:rPr>
-        <w:t xml:space="preserve">Đã xác nhận</w:t>
-      </w:r>
-    </w:p>
-    <w:p>
-      <w:pPr>
-        <w:pStyle w:val="Compact"/>
-        <w:numPr>
-          <w:ilvl w:val="0"/>
-          <w:numId w:val="1001"/>
-        </w:numPr>
-      </w:pPr>
-      <w:r>
-        <w:rPr>
-          <w:b/>
-          <w:bCs/>
-        </w:rPr>
-        <w:t xml:space="preserve">Biên bản bàn giao</w:t>
-      </w:r>
-      <w:r>
-        <w:t xml:space="preserve"> </w:t>
-      </w:r>
-      <w:r>
-        <w:t xml:space="preserve">→</w:t>
-      </w:r>
-      <w:r>
-        <w:t xml:space="preserve"> </w:t>
-      </w:r>
-      <w:r>
-        <w:rPr>
-          <w:i/>
-          <w:iCs/>
-        </w:rPr>
-        <w:t xml:space="preserve">Đã xác nhận</w:t>
-      </w:r>
-    </w:p>
-    <w:p>
-      <w:pPr>
-        <w:pStyle w:val="Compact"/>
-        <w:numPr>
-          <w:ilvl w:val="0"/>
-          <w:numId w:val="1001"/>
-        </w:numPr>
-      </w:pPr>
-      <w:r>
-        <w:rPr>
-          <w:b/>
-          <w:bCs/>
-        </w:rPr>
-        <w:t xml:space="preserve">Thanh toán cuối</w:t>
-      </w:r>
-      <w:r>
-        <w:t xml:space="preserve"> </w:t>
-      </w:r>
-      <w:r>
-        <w:t xml:space="preserve">→</w:t>
-      </w:r>
-      <w:r>
-        <w:t xml:space="preserve"> </w:t>
-      </w:r>
-      <w:r>
-        <w:rPr>
-          <w:i/>
-          <w:iCs/>
-        </w:rPr>
-        <w:t xml:space="preserve">Chờ xác nhận / Đã xác nhận</w:t>
-      </w:r>
-    </w:p>
-    <w:p>
-      <w:pPr>
-        <w:pStyle w:val="FirstParagraph"/>
-      </w:pPr>
-      <w:r>
-        <w:t xml:space="preserve">Mỗi dòng chứng từ có nút</w:t>
-      </w:r>
-      <w:r>
-        <w:t xml:space="preserve"> </w:t>
-      </w:r>
-      <w:r>
-        <w:rPr>
-          <w:b/>
-          <w:bCs/>
-        </w:rPr>
-        <w:t xml:space="preserve">Xem</w:t>
-      </w:r>
-      <w:r>
-        <w:t xml:space="preserve"> </w:t>
-      </w:r>
-      <w:r>
-        <w:t xml:space="preserve">và</w:t>
-      </w:r>
-      <w:r>
-        <w:t xml:space="preserve"> </w:t>
-      </w:r>
-      <w:r>
-        <w:rPr>
-          <w:b/>
-          <w:bCs/>
-        </w:rPr>
-        <w:t xml:space="preserve">In</w:t>
-      </w:r>
-      <w:r>
-        <w:t xml:space="preserve"> </w:t>
-      </w:r>
-      <w:r>
-        <w:t xml:space="preserve">(biểu tượng ✎/📄). Cột phải là bảng</w:t>
-      </w:r>
-      <w:r>
-        <w:t xml:space="preserve"> </w:t>
-      </w:r>
-      <w:r>
-        <w:rPr>
-          <w:b/>
-          <w:bCs/>
-        </w:rPr>
-        <w:t xml:space="preserve">Trạng</w:t>
-      </w:r>
-      <w:r>
-        <w:rPr>
-          <w:b/>
-          <w:bCs/>
-        </w:rPr>
-        <w:t xml:space="preserve"> </w:t>
-      </w:r>
-      <w:r>
-        <w:rPr>
-          <w:b/>
-          <w:bCs/>
-        </w:rPr>
-        <w:t xml:space="preserve">thái</w:t>
-      </w:r>
-      <w:r>
-        <w:t xml:space="preserve"> </w:t>
-      </w:r>
-      <w:r>
-        <w:t xml:space="preserve">tổng hợp.</w:t>
+        <w:t xml:space="preserve">Điền biểu mẫu:</w:t>
+      </w:r>
+      <w:r>
+        <w:t xml:space="preserve"> </w:t>
+      </w:r>
+      <w:r>
+        <w:rPr>
+          <w:b/>
+          <w:bCs/>
+        </w:rPr>
+        <w:t xml:space="preserve">Cửa hàng</w:t>
+      </w:r>
+      <w:r>
+        <w:t xml:space="preserve">,</w:t>
+      </w:r>
+      <w:r>
+        <w:t xml:space="preserve"> </w:t>
+      </w:r>
+      <w:r>
+        <w:rPr>
+          <w:b/>
+          <w:bCs/>
+        </w:rPr>
+        <w:t xml:space="preserve">Khách hàng</w:t>
+      </w:r>
+      <w:r>
+        <w:t xml:space="preserve"> </w:t>
+      </w:r>
+      <w:r>
+        <w:t xml:space="preserve">(chọn từ danh sách),</w:t>
+      </w:r>
+      <w:r>
+        <w:t xml:space="preserve"> </w:t>
+      </w:r>
+      <w:r>
+        <w:rPr>
+          <w:b/>
+          <w:bCs/>
+        </w:rPr>
+        <w:t xml:space="preserve">Mã đơn</w:t>
+      </w:r>
+      <w:r>
+        <w:t xml:space="preserve">,</w:t>
+      </w:r>
+      <w:r>
+        <w:t xml:space="preserve"> </w:t>
+      </w:r>
+      <w:r>
+        <w:rPr>
+          <w:b/>
+          <w:bCs/>
+        </w:rPr>
+        <w:t xml:space="preserve">Tiêu đề</w:t>
+      </w:r>
+      <w:r>
+        <w:t xml:space="preserve">,</w:t>
+      </w:r>
+      <w:r>
+        <w:t xml:space="preserve"> </w:t>
+      </w:r>
+      <w:r>
+        <w:rPr>
+          <w:b/>
+          <w:bCs/>
+        </w:rPr>
+        <w:t xml:space="preserve">Mô tả</w:t>
+      </w:r>
+      <w:r>
+        <w:t xml:space="preserve">. Bấm</w:t>
+      </w:r>
+      <w:r>
+        <w:t xml:space="preserve"> </w:t>
+      </w:r>
+      <w:r>
+        <w:rPr>
+          <w:b/>
+          <w:bCs/>
+        </w:rPr>
+        <w:t xml:space="preserve">Tạo Đơn Hàng</w:t>
+      </w:r>
+      <w:r>
+        <w:t xml:space="preserve">.</w:t>
       </w:r>
     </w:p>
     <w:p>
@@ -1372,20 +1324,2797 @@
       <w:r>
         <w:drawing>
           <wp:inline>
-            <wp:extent cx="5334000" cy="5956300"/>
+            <wp:extent cx="5334000" cy="3804179"/>
             <wp:effectExtent b="0" l="0" r="0" t="0"/>
-            <wp:docPr descr="Chi tiết đơn hàng và tiến trình chứng từ" title="" id="35" name="Picture"/>
+            <wp:docPr descr="Biểu mẫu tạo đơn hàng" title="" id="35" name="Picture"/>
             <a:graphic>
               <a:graphicData uri="http://schemas.openxmlformats.org/drawingml/2006/picture">
                 <pic:pic>
                   <pic:nvPicPr>
-                    <pic:cNvPr descr="images/04-don-hang/02-chi-tiet.png" id="36" name="Picture"/>
+                    <pic:cNvPr descr="images/04-don-hang/02-form-tao-don.png" id="36" name="Picture"/>
                     <pic:cNvPicPr>
                       <a:picLocks noChangeArrowheads="1" noChangeAspect="1"/>
                     </pic:cNvPicPr>
                   </pic:nvPicPr>
                   <pic:blipFill>
                     <a:blip r:embed="rId34"/>
+                    <a:stretch>
+                      <a:fillRect/>
+                    </a:stretch>
+                  </pic:blipFill>
+                  <pic:spPr bwMode="auto">
+                    <a:xfrm>
+                      <a:off x="0" y="0"/>
+                      <a:ext cx="5334000" cy="3804179"/>
+                    </a:xfrm>
+                    <a:prstGeom prst="rect">
+                      <a:avLst/>
+                    </a:prstGeom>
+                    <a:noFill/>
+                    <a:ln w="9525">
+                      <a:noFill/>
+                      <a:headEnd/>
+                      <a:tailEnd/>
+                    </a:ln>
+                  </pic:spPr>
+                </pic:pic>
+              </a:graphicData>
+            </a:graphic>
+          </wp:inline>
+        </w:drawing>
+      </w:r>
+    </w:p>
+    <w:p>
+      <w:pPr>
+        <w:pStyle w:val="ImageCaption"/>
+      </w:pPr>
+      <w:r>
+        <w:t xml:space="preserve">Biểu mẫu tạo đơn hàng</w:t>
+      </w:r>
+    </w:p>
+    <w:p>
+      <w:pPr>
+        <w:pStyle w:val="BodyText"/>
+      </w:pPr>
+      <w:r>
+        <w:rPr>
+          <w:b/>
+          <w:bCs/>
+        </w:rPr>
+        <w:t xml:space="preserve">Bước 3.</w:t>
+      </w:r>
+      <w:r>
+        <w:t xml:space="preserve"> </w:t>
+      </w:r>
+      <w:r>
+        <w:t xml:space="preserve">Đơn hàng mới hiện ra ở trạng thái</w:t>
+      </w:r>
+      <w:r>
+        <w:t xml:space="preserve"> </w:t>
+      </w:r>
+      <w:r>
+        <w:rPr>
+          <w:b/>
+          <w:bCs/>
+        </w:rPr>
+        <w:t xml:space="preserve">đang chờ</w:t>
+      </w:r>
+      <w:r>
+        <w:t xml:space="preserve"> </w:t>
+      </w:r>
+      <w:r>
+        <w:t xml:space="preserve">— các chứng từ đều là</w:t>
+      </w:r>
+      <w:r>
+        <w:t xml:space="preserve"> </w:t>
+      </w:r>
+      <w:r>
+        <w:rPr>
+          <w:i/>
+          <w:iCs/>
+        </w:rPr>
+        <w:t xml:space="preserve">Chưa có /</w:t>
+      </w:r>
+      <w:r>
+        <w:rPr>
+          <w:i/>
+          <w:iCs/>
+        </w:rPr>
+        <w:t xml:space="preserve"> </w:t>
+      </w:r>
+      <w:r>
+        <w:rPr>
+          <w:i/>
+          <w:iCs/>
+        </w:rPr>
+        <w:t xml:space="preserve">Pending</w:t>
+      </w:r>
+      <w:r>
+        <w:t xml:space="preserve">. Từ đây bạn lần lượt tạo Báo giá → Hợp đồng → …</w:t>
+      </w:r>
+    </w:p>
+    <w:p>
+      <w:pPr>
+        <w:pStyle w:val="CaptionedFigure"/>
+      </w:pPr>
+      <w:r>
+        <w:drawing>
+          <wp:inline>
+            <wp:extent cx="5334000" cy="4752445"/>
+            <wp:effectExtent b="0" l="0" r="0" t="0"/>
+            <wp:docPr descr="Đơn hàng mới — các bước đang chờ" title="" id="38" name="Picture"/>
+            <a:graphic>
+              <a:graphicData uri="http://schemas.openxmlformats.org/drawingml/2006/picture">
+                <pic:pic>
+                  <pic:nvPicPr>
+                    <pic:cNvPr descr="images/04-don-hang/03-don-moi-pending.png" id="39" name="Picture"/>
+                    <pic:cNvPicPr>
+                      <a:picLocks noChangeArrowheads="1" noChangeAspect="1"/>
+                    </pic:cNvPicPr>
+                  </pic:nvPicPr>
+                  <pic:blipFill>
+                    <a:blip r:embed="rId37"/>
+                    <a:stretch>
+                      <a:fillRect/>
+                    </a:stretch>
+                  </pic:blipFill>
+                  <pic:spPr bwMode="auto">
+                    <a:xfrm>
+                      <a:off x="0" y="0"/>
+                      <a:ext cx="5334000" cy="4752445"/>
+                    </a:xfrm>
+                    <a:prstGeom prst="rect">
+                      <a:avLst/>
+                    </a:prstGeom>
+                    <a:noFill/>
+                    <a:ln w="9525">
+                      <a:noFill/>
+                      <a:headEnd/>
+                      <a:tailEnd/>
+                    </a:ln>
+                  </pic:spPr>
+                </pic:pic>
+              </a:graphicData>
+            </a:graphic>
+          </wp:inline>
+        </w:drawing>
+      </w:r>
+    </w:p>
+    <w:p>
+      <w:pPr>
+        <w:pStyle w:val="ImageCaption"/>
+      </w:pPr>
+      <w:r>
+        <w:t xml:space="preserve">Đơn hàng mới — các bước đang chờ</w:t>
+      </w:r>
+    </w:p>
+    <w:bookmarkEnd w:id="40"/>
+    <w:bookmarkStart w:id="50" w:name="cách-tạo-báo-giá"/>
+    <w:p>
+      <w:pPr>
+        <w:pStyle w:val="Heading2"/>
+      </w:pPr>
+      <w:r>
+        <w:t xml:space="preserve">4.2. Cách tạo Báo giá</w:t>
+      </w:r>
+    </w:p>
+    <w:p>
+      <w:pPr>
+        <w:pStyle w:val="FirstParagraph"/>
+      </w:pPr>
+      <w:r>
+        <w:rPr>
+          <w:b/>
+          <w:bCs/>
+        </w:rPr>
+        <w:t xml:space="preserve">Bước 1.</w:t>
+      </w:r>
+      <w:r>
+        <w:t xml:space="preserve"> </w:t>
+      </w:r>
+      <w:r>
+        <w:t xml:space="preserve">Trong trang chi tiết đơn hàng, tại khối</w:t>
+      </w:r>
+      <w:r>
+        <w:t xml:space="preserve"> </w:t>
+      </w:r>
+      <w:r>
+        <w:rPr>
+          <w:b/>
+          <w:bCs/>
+        </w:rPr>
+        <w:t xml:space="preserve">Báo giá</w:t>
+      </w:r>
+      <w:r>
+        <w:t xml:space="preserve">, bấm</w:t>
+      </w:r>
+      <w:r>
+        <w:t xml:space="preserve"> </w:t>
+      </w:r>
+      <w:r>
+        <w:rPr>
+          <w:b/>
+          <w:bCs/>
+        </w:rPr>
+        <w:t xml:space="preserve">Tạo báo giá</w:t>
+      </w:r>
+      <w:r>
+        <w:t xml:space="preserve">.</w:t>
+      </w:r>
+    </w:p>
+    <w:p>
+      <w:pPr>
+        <w:pStyle w:val="BodyText"/>
+      </w:pPr>
+      <w:r>
+        <w:rPr>
+          <w:b/>
+          <w:bCs/>
+        </w:rPr>
+        <w:t xml:space="preserve">Bước 2.</w:t>
+      </w:r>
+      <w:r>
+        <w:t xml:space="preserve"> </w:t>
+      </w:r>
+      <w:r>
+        <w:t xml:space="preserve">Điền:</w:t>
+      </w:r>
+      <w:r>
+        <w:t xml:space="preserve"> </w:t>
+      </w:r>
+      <w:r>
+        <w:rPr>
+          <w:b/>
+          <w:bCs/>
+        </w:rPr>
+        <w:t xml:space="preserve">Số báo giá</w:t>
+      </w:r>
+      <w:r>
+        <w:t xml:space="preserve"> </w:t>
+      </w:r>
+      <w:r>
+        <w:t xml:space="preserve">(tự sinh, sửa được),</w:t>
+      </w:r>
+      <w:r>
+        <w:t xml:space="preserve"> </w:t>
+      </w:r>
+      <w:r>
+        <w:rPr>
+          <w:b/>
+          <w:bCs/>
+        </w:rPr>
+        <w:t xml:space="preserve">Ngày báo giá</w:t>
+      </w:r>
+      <w:r>
+        <w:t xml:space="preserve">,</w:t>
+      </w:r>
+      <w:r>
+        <w:t xml:space="preserve"> </w:t>
+      </w:r>
+      <w:r>
+        <w:rPr>
+          <w:b/>
+          <w:bCs/>
+        </w:rPr>
+        <w:t xml:space="preserve">Địa điểm</w:t>
+      </w:r>
+      <w:r>
+        <w:t xml:space="preserve">,</w:t>
+      </w:r>
+      <w:r>
+        <w:t xml:space="preserve"> </w:t>
+      </w:r>
+      <w:r>
+        <w:rPr>
+          <w:b/>
+          <w:bCs/>
+        </w:rPr>
+        <w:t xml:space="preserve">Thời</w:t>
+      </w:r>
+      <w:r>
+        <w:rPr>
+          <w:b/>
+          <w:bCs/>
+        </w:rPr>
+        <w:t xml:space="preserve"> </w:t>
+      </w:r>
+      <w:r>
+        <w:rPr>
+          <w:b/>
+          <w:bCs/>
+        </w:rPr>
+        <w:t xml:space="preserve">hạn hiệu lực</w:t>
+      </w:r>
+      <w:r>
+        <w:t xml:space="preserve">. Ở</w:t>
+      </w:r>
+      <w:r>
+        <w:t xml:space="preserve"> </w:t>
+      </w:r>
+      <w:r>
+        <w:rPr>
+          <w:b/>
+          <w:bCs/>
+        </w:rPr>
+        <w:t xml:space="preserve">Bảng Hạng Mục</w:t>
+      </w:r>
+      <w:r>
+        <w:t xml:space="preserve">, nhập từng dòng (Hạng mục, ĐVT, SL, Đơn giá) — bấm</w:t>
+      </w:r>
+      <w:r>
+        <w:t xml:space="preserve"> </w:t>
+      </w:r>
+      <w:r>
+        <w:rPr>
+          <w:b/>
+          <w:bCs/>
+        </w:rPr>
+        <w:t xml:space="preserve">+ Thêm Dòng</w:t>
+      </w:r>
+      <w:r>
+        <w:t xml:space="preserve"> </w:t>
+      </w:r>
+      <w:r>
+        <w:t xml:space="preserve">để thêm. Nhập</w:t>
+      </w:r>
+      <w:r>
+        <w:t xml:space="preserve"> </w:t>
+      </w:r>
+      <w:r>
+        <w:rPr>
+          <w:b/>
+          <w:bCs/>
+        </w:rPr>
+        <w:t xml:space="preserve">VAT %</w:t>
+      </w:r>
+      <w:r>
+        <w:t xml:space="preserve">, phí (nếu có),</w:t>
+      </w:r>
+      <w:r>
+        <w:t xml:space="preserve"> </w:t>
+      </w:r>
+      <w:r>
+        <w:rPr>
+          <w:b/>
+          <w:bCs/>
+        </w:rPr>
+        <w:t xml:space="preserve">điều khoản thanh toán</w:t>
+      </w:r>
+      <w:r>
+        <w:t xml:space="preserve">. Bấm</w:t>
+      </w:r>
+      <w:r>
+        <w:t xml:space="preserve"> </w:t>
+      </w:r>
+      <w:r>
+        <w:rPr>
+          <w:b/>
+          <w:bCs/>
+        </w:rPr>
+        <w:t xml:space="preserve">Tạo</w:t>
+      </w:r>
+      <w:r>
+        <w:rPr>
+          <w:b/>
+          <w:bCs/>
+        </w:rPr>
+        <w:t xml:space="preserve"> </w:t>
+      </w:r>
+      <w:r>
+        <w:rPr>
+          <w:b/>
+          <w:bCs/>
+        </w:rPr>
+        <w:t xml:space="preserve">Báo Giá</w:t>
+      </w:r>
+      <w:r>
+        <w:t xml:space="preserve">.</w:t>
+      </w:r>
+    </w:p>
+    <w:p>
+      <w:pPr>
+        <w:pStyle w:val="CaptionedFigure"/>
+      </w:pPr>
+      <w:r>
+        <w:drawing>
+          <wp:inline>
+            <wp:extent cx="5334000" cy="5341408"/>
+            <wp:effectExtent b="0" l="0" r="0" t="0"/>
+            <wp:docPr descr="Biểu mẫu tạo báo giá" title="" id="42" name="Picture"/>
+            <a:graphic>
+              <a:graphicData uri="http://schemas.openxmlformats.org/drawingml/2006/picture">
+                <pic:pic>
+                  <pic:nvPicPr>
+                    <pic:cNvPr descr="images/04b-bao-gia/01-form-tao.png" id="43" name="Picture"/>
+                    <pic:cNvPicPr>
+                      <a:picLocks noChangeArrowheads="1" noChangeAspect="1"/>
+                    </pic:cNvPicPr>
+                  </pic:nvPicPr>
+                  <pic:blipFill>
+                    <a:blip r:embed="rId41"/>
+                    <a:stretch>
+                      <a:fillRect/>
+                    </a:stretch>
+                  </pic:blipFill>
+                  <pic:spPr bwMode="auto">
+                    <a:xfrm>
+                      <a:off x="0" y="0"/>
+                      <a:ext cx="5334000" cy="5341408"/>
+                    </a:xfrm>
+                    <a:prstGeom prst="rect">
+                      <a:avLst/>
+                    </a:prstGeom>
+                    <a:noFill/>
+                    <a:ln w="9525">
+                      <a:noFill/>
+                      <a:headEnd/>
+                      <a:tailEnd/>
+                    </a:ln>
+                  </pic:spPr>
+                </pic:pic>
+              </a:graphicData>
+            </a:graphic>
+          </wp:inline>
+        </w:drawing>
+      </w:r>
+    </w:p>
+    <w:p>
+      <w:pPr>
+        <w:pStyle w:val="ImageCaption"/>
+      </w:pPr>
+      <w:r>
+        <w:t xml:space="preserve">Biểu mẫu tạo báo giá</w:t>
+      </w:r>
+    </w:p>
+    <w:p>
+      <w:pPr>
+        <w:pStyle w:val="BodyText"/>
+      </w:pPr>
+      <w:r>
+        <w:rPr>
+          <w:b/>
+          <w:bCs/>
+        </w:rPr>
+        <w:t xml:space="preserve">Bước 3.</w:t>
+      </w:r>
+      <w:r>
+        <w:t xml:space="preserve"> </w:t>
+      </w:r>
+      <w:r>
+        <w:t xml:space="preserve">Trang</w:t>
+      </w:r>
+      <w:r>
+        <w:t xml:space="preserve"> </w:t>
+      </w:r>
+      <w:r>
+        <w:rPr>
+          <w:b/>
+          <w:bCs/>
+        </w:rPr>
+        <w:t xml:space="preserve">xem báo giá</w:t>
+      </w:r>
+      <w:r>
+        <w:t xml:space="preserve"> </w:t>
+      </w:r>
+      <w:r>
+        <w:t xml:space="preserve">hiện ra với đầy đủ hạng mục, VAT, tổng tiền. Kiểm tra lại;</w:t>
+      </w:r>
+      <w:r>
+        <w:t xml:space="preserve"> </w:t>
+      </w:r>
+      <w:r>
+        <w:t xml:space="preserve">nếu cần</w:t>
+      </w:r>
+      <w:r>
+        <w:t xml:space="preserve"> </w:t>
+      </w:r>
+      <w:r>
+        <w:rPr>
+          <w:b/>
+          <w:bCs/>
+        </w:rPr>
+        <w:t xml:space="preserve">sửa</w:t>
+      </w:r>
+      <w:r>
+        <w:t xml:space="preserve"> </w:t>
+      </w:r>
+      <w:r>
+        <w:t xml:space="preserve">thì bấm</w:t>
+      </w:r>
+      <w:r>
+        <w:t xml:space="preserve"> </w:t>
+      </w:r>
+      <w:r>
+        <w:rPr>
+          <w:b/>
+          <w:bCs/>
+        </w:rPr>
+        <w:t xml:space="preserve">Sửa</w:t>
+      </w:r>
+      <w:r>
+        <w:t xml:space="preserve"> </w:t>
+      </w:r>
+      <w:r>
+        <w:t xml:space="preserve">(chỉ sửa được khi</w:t>
+      </w:r>
+      <w:r>
+        <w:t xml:space="preserve"> </w:t>
+      </w:r>
+      <w:r>
+        <w:rPr>
+          <w:i/>
+          <w:iCs/>
+        </w:rPr>
+        <w:t xml:space="preserve">chưa duyệt</w:t>
+      </w:r>
+      <w:r>
+        <w:t xml:space="preserve">).</w:t>
+      </w:r>
+    </w:p>
+    <w:p>
+      <w:pPr>
+        <w:pStyle w:val="BodyText"/>
+      </w:pPr>
+      <w:r>
+        <w:rPr>
+          <w:b/>
+          <w:bCs/>
+        </w:rPr>
+        <w:t xml:space="preserve">Bước 4.</w:t>
+      </w:r>
+      <w:r>
+        <w:t xml:space="preserve"> </w:t>
+      </w:r>
+      <w:r>
+        <w:t xml:space="preserve">Nếu đúng, bấm</w:t>
+      </w:r>
+      <w:r>
+        <w:t xml:space="preserve"> </w:t>
+      </w:r>
+      <w:r>
+        <w:rPr>
+          <w:b/>
+          <w:bCs/>
+        </w:rPr>
+        <w:t xml:space="preserve">Duyệt</w:t>
+      </w:r>
+      <w:r>
+        <w:t xml:space="preserve"> </w:t>
+      </w:r>
+      <w:r>
+        <w:t xml:space="preserve">(Approve) để chốt báo giá. Sau khi duyệt, báo giá</w:t>
+      </w:r>
+      <w:r>
+        <w:t xml:space="preserve"> </w:t>
+      </w:r>
+      <w:r>
+        <w:rPr>
+          <w:b/>
+          <w:bCs/>
+        </w:rPr>
+        <w:t xml:space="preserve">khóa</w:t>
+      </w:r>
+      <w:r>
+        <w:t xml:space="preserve"> </w:t>
+      </w:r>
+      <w:r>
+        <w:t xml:space="preserve">(không sửa) và mở khóa bước</w:t>
+      </w:r>
+      <w:r>
+        <w:t xml:space="preserve"> </w:t>
+      </w:r>
+      <w:r>
+        <w:rPr>
+          <w:b/>
+          <w:bCs/>
+        </w:rPr>
+        <w:t xml:space="preserve">Hợp đồng</w:t>
+      </w:r>
+      <w:r>
+        <w:t xml:space="preserve">.</w:t>
+      </w:r>
+    </w:p>
+    <w:p>
+      <w:pPr>
+        <w:pStyle w:val="CaptionedFigure"/>
+      </w:pPr>
+      <w:r>
+        <w:drawing>
+          <wp:inline>
+            <wp:extent cx="5334000" cy="4326466"/>
+            <wp:effectExtent b="0" l="0" r="0" t="0"/>
+            <wp:docPr descr="Xem báo giá — nút Sửa / Duyệt / Tạo tài liệu" title="" id="45" name="Picture"/>
+            <a:graphic>
+              <a:graphicData uri="http://schemas.openxmlformats.org/drawingml/2006/picture">
+                <pic:pic>
+                  <pic:nvPicPr>
+                    <pic:cNvPr descr="images/04b-bao-gia/02-xem-va-duyet.png" id="46" name="Picture"/>
+                    <pic:cNvPicPr>
+                      <a:picLocks noChangeArrowheads="1" noChangeAspect="1"/>
+                    </pic:cNvPicPr>
+                  </pic:nvPicPr>
+                  <pic:blipFill>
+                    <a:blip r:embed="rId44"/>
+                    <a:stretch>
+                      <a:fillRect/>
+                    </a:stretch>
+                  </pic:blipFill>
+                  <pic:spPr bwMode="auto">
+                    <a:xfrm>
+                      <a:off x="0" y="0"/>
+                      <a:ext cx="5334000" cy="4326466"/>
+                    </a:xfrm>
+                    <a:prstGeom prst="rect">
+                      <a:avLst/>
+                    </a:prstGeom>
+                    <a:noFill/>
+                    <a:ln w="9525">
+                      <a:noFill/>
+                      <a:headEnd/>
+                      <a:tailEnd/>
+                    </a:ln>
+                  </pic:spPr>
+                </pic:pic>
+              </a:graphicData>
+            </a:graphic>
+          </wp:inline>
+        </w:drawing>
+      </w:r>
+    </w:p>
+    <w:p>
+      <w:pPr>
+        <w:pStyle w:val="ImageCaption"/>
+      </w:pPr>
+      <w:r>
+        <w:t xml:space="preserve">Xem báo giá — nút Sửa / Duyệt / Tạo tài liệu</w:t>
+      </w:r>
+    </w:p>
+    <w:p>
+      <w:pPr>
+        <w:pStyle w:val="BodyText"/>
+      </w:pPr>
+      <w:r>
+        <w:rPr>
+          <w:b/>
+          <w:bCs/>
+        </w:rPr>
+        <w:t xml:space="preserve">Bước 5.</w:t>
+      </w:r>
+      <w:r>
+        <w:t xml:space="preserve"> </w:t>
+      </w:r>
+      <w:r>
+        <w:rPr>
+          <w:b/>
+          <w:bCs/>
+        </w:rPr>
+        <w:t xml:space="preserve">In &amp; tải báo giá:</w:t>
+      </w:r>
+      <w:r>
+        <w:t xml:space="preserve"> </w:t>
+      </w:r>
+      <w:r>
+        <w:t xml:space="preserve">bấm</w:t>
+      </w:r>
+      <w:r>
+        <w:t xml:space="preserve"> </w:t>
+      </w:r>
+      <w:r>
+        <w:rPr>
+          <w:b/>
+          <w:bCs/>
+        </w:rPr>
+        <w:t xml:space="preserve">Tạo Tài Liệu</w:t>
+      </w:r>
+      <w:r>
+        <w:t xml:space="preserve">, chọn định dạng</w:t>
+      </w:r>
+      <w:r>
+        <w:t xml:space="preserve"> </w:t>
+      </w:r>
+      <w:r>
+        <w:rPr>
+          <w:b/>
+          <w:bCs/>
+        </w:rPr>
+        <w:t xml:space="preserve">PDF</w:t>
+      </w:r>
+      <w:r>
+        <w:t xml:space="preserve"> </w:t>
+      </w:r>
+      <w:r>
+        <w:t xml:space="preserve">hoặc</w:t>
+      </w:r>
+      <w:r>
+        <w:t xml:space="preserve"> </w:t>
+      </w:r>
+      <w:r>
+        <w:rPr>
+          <w:b/>
+          <w:bCs/>
+        </w:rPr>
+        <w:t xml:space="preserve">DOCX</w:t>
+      </w:r>
+      <w:r>
+        <w:t xml:space="preserve">,</w:t>
+      </w:r>
+      <w:r>
+        <w:t xml:space="preserve"> </w:t>
+      </w:r>
+      <w:r>
+        <w:t xml:space="preserve">bấm</w:t>
+      </w:r>
+      <w:r>
+        <w:t xml:space="preserve"> </w:t>
+      </w:r>
+      <w:r>
+        <w:rPr>
+          <w:b/>
+          <w:bCs/>
+        </w:rPr>
+        <w:t xml:space="preserve">Tạo</w:t>
+      </w:r>
+      <w:r>
+        <w:t xml:space="preserve">. File xuất hiện ở mục</w:t>
+      </w:r>
+      <w:r>
+        <w:t xml:space="preserve"> </w:t>
+      </w:r>
+      <w:r>
+        <w:rPr>
+          <w:b/>
+          <w:bCs/>
+        </w:rPr>
+        <w:t xml:space="preserve">Tài Liệu Đã Tạo</w:t>
+      </w:r>
+      <w:r>
+        <w:t xml:space="preserve"> </w:t>
+      </w:r>
+      <w:r>
+        <w:t xml:space="preserve">— bấm để</w:t>
+      </w:r>
+      <w:r>
+        <w:t xml:space="preserve"> </w:t>
+      </w:r>
+      <w:r>
+        <w:rPr>
+          <w:b/>
+          <w:bCs/>
+        </w:rPr>
+        <w:t xml:space="preserve">tải về</w:t>
+      </w:r>
+      <w:r>
+        <w:t xml:space="preserve">.</w:t>
+      </w:r>
+    </w:p>
+    <w:p>
+      <w:pPr>
+        <w:pStyle w:val="CaptionedFigure"/>
+      </w:pPr>
+      <w:r>
+        <w:drawing>
+          <wp:inline>
+            <wp:extent cx="5334000" cy="4326466"/>
+            <wp:effectExtent b="0" l="0" r="0" t="0"/>
+            <wp:docPr descr="Tạo tài liệu — chọn PDF/DOCX" title="" id="48" name="Picture"/>
+            <a:graphic>
+              <a:graphicData uri="http://schemas.openxmlformats.org/drawingml/2006/picture">
+                <pic:pic>
+                  <pic:nvPicPr>
+                    <pic:cNvPr descr="images/04b-bao-gia/03-in-tai-modal.png" id="49" name="Picture"/>
+                    <pic:cNvPicPr>
+                      <a:picLocks noChangeArrowheads="1" noChangeAspect="1"/>
+                    </pic:cNvPicPr>
+                  </pic:nvPicPr>
+                  <pic:blipFill>
+                    <a:blip r:embed="rId47"/>
+                    <a:stretch>
+                      <a:fillRect/>
+                    </a:stretch>
+                  </pic:blipFill>
+                  <pic:spPr bwMode="auto">
+                    <a:xfrm>
+                      <a:off x="0" y="0"/>
+                      <a:ext cx="5334000" cy="4326466"/>
+                    </a:xfrm>
+                    <a:prstGeom prst="rect">
+                      <a:avLst/>
+                    </a:prstGeom>
+                    <a:noFill/>
+                    <a:ln w="9525">
+                      <a:noFill/>
+                      <a:headEnd/>
+                      <a:tailEnd/>
+                    </a:ln>
+                  </pic:spPr>
+                </pic:pic>
+              </a:graphicData>
+            </a:graphic>
+          </wp:inline>
+        </w:drawing>
+      </w:r>
+    </w:p>
+    <w:p>
+      <w:pPr>
+        <w:pStyle w:val="ImageCaption"/>
+      </w:pPr>
+      <w:r>
+        <w:t xml:space="preserve">Tạo tài liệu — chọn PDF/DOCX</w:t>
+      </w:r>
+    </w:p>
+    <w:bookmarkEnd w:id="50"/>
+    <w:bookmarkStart w:id="57" w:name="cách-tạo-hợp-đồng"/>
+    <w:p>
+      <w:pPr>
+        <w:pStyle w:val="Heading2"/>
+      </w:pPr>
+      <w:r>
+        <w:t xml:space="preserve">4.3. Cách tạo Hợp đồng</w:t>
+      </w:r>
+    </w:p>
+    <w:p>
+      <w:pPr>
+        <w:pStyle w:val="FirstParagraph"/>
+      </w:pPr>
+      <w:r>
+        <w:rPr>
+          <w:b/>
+          <w:bCs/>
+        </w:rPr>
+        <w:t xml:space="preserve">Bước 1.</w:t>
+      </w:r>
+      <w:r>
+        <w:t xml:space="preserve"> </w:t>
+      </w:r>
+      <w:r>
+        <w:t xml:space="preserve">Sau khi</w:t>
+      </w:r>
+      <w:r>
+        <w:t xml:space="preserve"> </w:t>
+      </w:r>
+      <w:r>
+        <w:rPr>
+          <w:b/>
+          <w:bCs/>
+        </w:rPr>
+        <w:t xml:space="preserve">duyệt báo giá</w:t>
+      </w:r>
+      <w:r>
+        <w:t xml:space="preserve">, tại khối</w:t>
+      </w:r>
+      <w:r>
+        <w:t xml:space="preserve"> </w:t>
+      </w:r>
+      <w:r>
+        <w:rPr>
+          <w:b/>
+          <w:bCs/>
+        </w:rPr>
+        <w:t xml:space="preserve">Hợp đồng</w:t>
+      </w:r>
+      <w:r>
+        <w:t xml:space="preserve"> </w:t>
+      </w:r>
+      <w:r>
+        <w:t xml:space="preserve">trên trang đơn hàng, bấm</w:t>
+      </w:r>
+      <w:r>
+        <w:t xml:space="preserve"> </w:t>
+      </w:r>
+      <w:r>
+        <w:rPr>
+          <w:b/>
+          <w:bCs/>
+        </w:rPr>
+        <w:t xml:space="preserve">Tạo</w:t>
+      </w:r>
+      <w:r>
+        <w:rPr>
+          <w:b/>
+          <w:bCs/>
+        </w:rPr>
+        <w:t xml:space="preserve"> </w:t>
+      </w:r>
+      <w:r>
+        <w:rPr>
+          <w:b/>
+          <w:bCs/>
+        </w:rPr>
+        <w:t xml:space="preserve">hợp đồng</w:t>
+      </w:r>
+      <w:r>
+        <w:t xml:space="preserve">.</w:t>
+      </w:r>
+    </w:p>
+    <w:p>
+      <w:pPr>
+        <w:pStyle w:val="BodyText"/>
+      </w:pPr>
+      <w:r>
+        <w:rPr>
+          <w:b/>
+          <w:bCs/>
+        </w:rPr>
+        <w:t xml:space="preserve">Bước 2.</w:t>
+      </w:r>
+      <w:r>
+        <w:t xml:space="preserve"> </w:t>
+      </w:r>
+      <w:r>
+        <w:t xml:space="preserve">Điền:</w:t>
+      </w:r>
+      <w:r>
+        <w:t xml:space="preserve"> </w:t>
+      </w:r>
+      <w:r>
+        <w:rPr>
+          <w:b/>
+          <w:bCs/>
+        </w:rPr>
+        <w:t xml:space="preserve">Số hợp đồng</w:t>
+      </w:r>
+      <w:r>
+        <w:t xml:space="preserve">,</w:t>
+      </w:r>
+      <w:r>
+        <w:t xml:space="preserve"> </w:t>
+      </w:r>
+      <w:r>
+        <w:rPr>
+          <w:b/>
+          <w:bCs/>
+        </w:rPr>
+        <w:t xml:space="preserve">Ngày ký</w:t>
+      </w:r>
+      <w:r>
+        <w:t xml:space="preserve">,</w:t>
+      </w:r>
+      <w:r>
+        <w:t xml:space="preserve"> </w:t>
+      </w:r>
+      <w:r>
+        <w:rPr>
+          <w:b/>
+          <w:bCs/>
+        </w:rPr>
+        <w:t xml:space="preserve">Địa điểm ký</w:t>
+      </w:r>
+      <w:r>
+        <w:t xml:space="preserve">,</w:t>
+      </w:r>
+      <w:r>
+        <w:t xml:space="preserve"> </w:t>
+      </w:r>
+      <w:r>
+        <w:rPr>
+          <w:b/>
+          <w:bCs/>
+        </w:rPr>
+        <w:t xml:space="preserve">Ngày bắt đầu</w:t>
+      </w:r>
+      <w:r>
+        <w:t xml:space="preserve">,</w:t>
+      </w:r>
+      <w:r>
+        <w:t xml:space="preserve"> </w:t>
+      </w:r>
+      <w:r>
+        <w:rPr>
+          <w:b/>
+          <w:bCs/>
+        </w:rPr>
+        <w:t xml:space="preserve">Số ngày</w:t>
+      </w:r>
+      <w:r>
+        <w:rPr>
+          <w:b/>
+          <w:bCs/>
+        </w:rPr>
+        <w:t xml:space="preserve"> </w:t>
+      </w:r>
+      <w:r>
+        <w:rPr>
+          <w:b/>
+          <w:bCs/>
+        </w:rPr>
+        <w:t xml:space="preserve">hoàn thành</w:t>
+      </w:r>
+      <w:r>
+        <w:t xml:space="preserve">. Chọn</w:t>
+      </w:r>
+      <w:r>
+        <w:t xml:space="preserve"> </w:t>
+      </w:r>
+      <w:r>
+        <w:rPr>
+          <w:b/>
+          <w:bCs/>
+        </w:rPr>
+        <w:t xml:space="preserve">Báo giá tham chiếu</w:t>
+      </w:r>
+      <w:r>
+        <w:t xml:space="preserve"> </w:t>
+      </w:r>
+      <w:r>
+        <w:t xml:space="preserve">— hệ thống</w:t>
+      </w:r>
+      <w:r>
+        <w:t xml:space="preserve"> </w:t>
+      </w:r>
+      <w:r>
+        <w:rPr>
+          <w:b/>
+          <w:bCs/>
+        </w:rPr>
+        <w:t xml:space="preserve">tự sao chép hạng mục</w:t>
+      </w:r>
+      <w:r>
+        <w:t xml:space="preserve"> </w:t>
+      </w:r>
+      <w:r>
+        <w:t xml:space="preserve">từ báo giá.</w:t>
+      </w:r>
+      <w:r>
+        <w:t xml:space="preserve"> </w:t>
+      </w:r>
+      <w:r>
+        <w:t xml:space="preserve">Nhập</w:t>
+      </w:r>
+      <w:r>
+        <w:t xml:space="preserve"> </w:t>
+      </w:r>
+      <w:r>
+        <w:rPr>
+          <w:b/>
+          <w:bCs/>
+        </w:rPr>
+        <w:t xml:space="preserve">% Tạm ứng</w:t>
+      </w:r>
+      <w:r>
+        <w:t xml:space="preserve">, chọn</w:t>
+      </w:r>
+      <w:r>
+        <w:t xml:space="preserve"> </w:t>
+      </w:r>
+      <w:r>
+        <w:rPr>
+          <w:b/>
+          <w:bCs/>
+        </w:rPr>
+        <w:t xml:space="preserve">tài khoản ngân hàng</w:t>
+      </w:r>
+      <w:r>
+        <w:t xml:space="preserve"> </w:t>
+      </w:r>
+      <w:r>
+        <w:t xml:space="preserve">nhận thanh toán,</w:t>
+      </w:r>
+      <w:r>
+        <w:t xml:space="preserve"> </w:t>
+      </w:r>
+      <w:r>
+        <w:rPr>
+          <w:b/>
+          <w:bCs/>
+        </w:rPr>
+        <w:t xml:space="preserve">điều khoản hợp đồng</w:t>
+      </w:r>
+      <w:r>
+        <w:t xml:space="preserve">.</w:t>
+      </w:r>
+      <w:r>
+        <w:t xml:space="preserve"> </w:t>
+      </w:r>
+      <w:r>
+        <w:t xml:space="preserve">Bấm</w:t>
+      </w:r>
+      <w:r>
+        <w:t xml:space="preserve"> </w:t>
+      </w:r>
+      <w:r>
+        <w:rPr>
+          <w:b/>
+          <w:bCs/>
+        </w:rPr>
+        <w:t xml:space="preserve">Tạo Hợp Đồng</w:t>
+      </w:r>
+      <w:r>
+        <w:t xml:space="preserve">.</w:t>
+      </w:r>
+    </w:p>
+    <w:p>
+      <w:pPr>
+        <w:pStyle w:val="CaptionedFigure"/>
+      </w:pPr>
+      <w:r>
+        <w:drawing>
+          <wp:inline>
+            <wp:extent cx="5334000" cy="6874933"/>
+            <wp:effectExtent b="0" l="0" r="0" t="0"/>
+            <wp:docPr descr="Biểu mẫu tạo hợp đồng" title="" id="52" name="Picture"/>
+            <a:graphic>
+              <a:graphicData uri="http://schemas.openxmlformats.org/drawingml/2006/picture">
+                <pic:pic>
+                  <pic:nvPicPr>
+                    <pic:cNvPr descr="images/04c-hop-dong/01-form-tao.png" id="53" name="Picture"/>
+                    <pic:cNvPicPr>
+                      <a:picLocks noChangeArrowheads="1" noChangeAspect="1"/>
+                    </pic:cNvPicPr>
+                  </pic:nvPicPr>
+                  <pic:blipFill>
+                    <a:blip r:embed="rId51"/>
+                    <a:stretch>
+                      <a:fillRect/>
+                    </a:stretch>
+                  </pic:blipFill>
+                  <pic:spPr bwMode="auto">
+                    <a:xfrm>
+                      <a:off x="0" y="0"/>
+                      <a:ext cx="5334000" cy="6874933"/>
+                    </a:xfrm>
+                    <a:prstGeom prst="rect">
+                      <a:avLst/>
+                    </a:prstGeom>
+                    <a:noFill/>
+                    <a:ln w="9525">
+                      <a:noFill/>
+                      <a:headEnd/>
+                      <a:tailEnd/>
+                    </a:ln>
+                  </pic:spPr>
+                </pic:pic>
+              </a:graphicData>
+            </a:graphic>
+          </wp:inline>
+        </w:drawing>
+      </w:r>
+    </w:p>
+    <w:p>
+      <w:pPr>
+        <w:pStyle w:val="ImageCaption"/>
+      </w:pPr>
+      <w:r>
+        <w:t xml:space="preserve">Biểu mẫu tạo hợp đồng</w:t>
+      </w:r>
+    </w:p>
+    <w:p>
+      <w:pPr>
+        <w:pStyle w:val="BodyText"/>
+      </w:pPr>
+      <w:r>
+        <w:rPr>
+          <w:b/>
+          <w:bCs/>
+        </w:rPr>
+        <w:t xml:space="preserve">Bước 3.</w:t>
+      </w:r>
+      <w:r>
+        <w:t xml:space="preserve"> </w:t>
+      </w:r>
+      <w:r>
+        <w:t xml:space="preserve">Ở trang</w:t>
+      </w:r>
+      <w:r>
+        <w:t xml:space="preserve"> </w:t>
+      </w:r>
+      <w:r>
+        <w:rPr>
+          <w:b/>
+          <w:bCs/>
+        </w:rPr>
+        <w:t xml:space="preserve">xem hợp đồng</w:t>
+      </w:r>
+      <w:r>
+        <w:t xml:space="preserve">, kiểm tra nội dung. Bấm</w:t>
+      </w:r>
+      <w:r>
+        <w:t xml:space="preserve"> </w:t>
+      </w:r>
+      <w:r>
+        <w:rPr>
+          <w:b/>
+          <w:bCs/>
+        </w:rPr>
+        <w:t xml:space="preserve">Sửa</w:t>
+      </w:r>
+      <w:r>
+        <w:t xml:space="preserve"> </w:t>
+      </w:r>
+      <w:r>
+        <w:t xml:space="preserve">nếu cần (khi</w:t>
+      </w:r>
+      <w:r>
+        <w:t xml:space="preserve"> </w:t>
+      </w:r>
+      <w:r>
+        <w:rPr>
+          <w:i/>
+          <w:iCs/>
+        </w:rPr>
+        <w:t xml:space="preserve">chưa ký</w:t>
+      </w:r>
+      <w:r>
+        <w:t xml:space="preserve">).</w:t>
+      </w:r>
+    </w:p>
+    <w:p>
+      <w:pPr>
+        <w:pStyle w:val="BodyText"/>
+      </w:pPr>
+      <w:r>
+        <w:rPr>
+          <w:b/>
+          <w:bCs/>
+        </w:rPr>
+        <w:t xml:space="preserve">Bước 4.</w:t>
+      </w:r>
+      <w:r>
+        <w:t xml:space="preserve"> </w:t>
+      </w:r>
+      <w:r>
+        <w:t xml:space="preserve">Bấm</w:t>
+      </w:r>
+      <w:r>
+        <w:t xml:space="preserve"> </w:t>
+      </w:r>
+      <w:r>
+        <w:rPr>
+          <w:b/>
+          <w:bCs/>
+        </w:rPr>
+        <w:t xml:space="preserve">Ký hợp đồng</w:t>
+      </w:r>
+      <w:r>
+        <w:t xml:space="preserve"> </w:t>
+      </w:r>
+      <w:r>
+        <w:t xml:space="preserve">(Sign). ⭐</w:t>
+      </w:r>
+      <w:r>
+        <w:t xml:space="preserve"> </w:t>
+      </w:r>
+      <w:r>
+        <w:rPr>
+          <w:i/>
+          <w:iCs/>
+        </w:rPr>
+        <w:t xml:space="preserve">Khi ký, phần mềm</w:t>
+      </w:r>
+      <w:r>
+        <w:rPr>
+          <w:i/>
+          <w:iCs/>
+        </w:rPr>
+        <w:t xml:space="preserve"> </w:t>
+      </w:r>
+      <w:r>
+        <w:rPr>
+          <w:b/>
+          <w:bCs/>
+          <w:i/>
+          <w:iCs/>
+        </w:rPr>
+        <w:t xml:space="preserve">tự tạo Kế hoạch sản xuất</w:t>
+      </w:r>
+      <w:r>
+        <w:rPr>
+          <w:i/>
+          <w:iCs/>
+        </w:rPr>
+        <w:t xml:space="preserve"> </w:t>
+      </w:r>
+      <w:r>
+        <w:rPr>
+          <w:i/>
+          <w:iCs/>
+        </w:rPr>
+        <w:t xml:space="preserve">cho</w:t>
+      </w:r>
+      <w:r>
+        <w:rPr>
+          <w:i/>
+          <w:iCs/>
+        </w:rPr>
+        <w:t xml:space="preserve"> </w:t>
+      </w:r>
+      <w:r>
+        <w:rPr>
+          <w:i/>
+          <w:iCs/>
+        </w:rPr>
+        <w:t xml:space="preserve">đơn — xem Mục 5.</w:t>
+      </w:r>
+      <w:r>
+        <w:t xml:space="preserve"> </w:t>
+      </w:r>
+      <w:r>
+        <w:t xml:space="preserve">Hợp đồng đã ký sẽ</w:t>
+      </w:r>
+      <w:r>
+        <w:t xml:space="preserve"> </w:t>
+      </w:r>
+      <w:r>
+        <w:rPr>
+          <w:b/>
+          <w:bCs/>
+        </w:rPr>
+        <w:t xml:space="preserve">khóa</w:t>
+      </w:r>
+      <w:r>
+        <w:t xml:space="preserve">.</w:t>
+      </w:r>
+    </w:p>
+    <w:p>
+      <w:pPr>
+        <w:pStyle w:val="CaptionedFigure"/>
+      </w:pPr>
+      <w:r>
+        <w:drawing>
+          <wp:inline>
+            <wp:extent cx="5334000" cy="5841470"/>
+            <wp:effectExtent b="0" l="0" r="0" t="0"/>
+            <wp:docPr descr="Xem hợp đồng — nút Ký / Sửa / Tạo tài liệu" title="" id="55" name="Picture"/>
+            <a:graphic>
+              <a:graphicData uri="http://schemas.openxmlformats.org/drawingml/2006/picture">
+                <pic:pic>
+                  <pic:nvPicPr>
+                    <pic:cNvPr descr="images/04c-hop-dong/02-xem-va-ky.png" id="56" name="Picture"/>
+                    <pic:cNvPicPr>
+                      <a:picLocks noChangeArrowheads="1" noChangeAspect="1"/>
+                    </pic:cNvPicPr>
+                  </pic:nvPicPr>
+                  <pic:blipFill>
+                    <a:blip r:embed="rId54"/>
+                    <a:stretch>
+                      <a:fillRect/>
+                    </a:stretch>
+                  </pic:blipFill>
+                  <pic:spPr bwMode="auto">
+                    <a:xfrm>
+                      <a:off x="0" y="0"/>
+                      <a:ext cx="5334000" cy="5841470"/>
+                    </a:xfrm>
+                    <a:prstGeom prst="rect">
+                      <a:avLst/>
+                    </a:prstGeom>
+                    <a:noFill/>
+                    <a:ln w="9525">
+                      <a:noFill/>
+                      <a:headEnd/>
+                      <a:tailEnd/>
+                    </a:ln>
+                  </pic:spPr>
+                </pic:pic>
+              </a:graphicData>
+            </a:graphic>
+          </wp:inline>
+        </w:drawing>
+      </w:r>
+    </w:p>
+    <w:p>
+      <w:pPr>
+        <w:pStyle w:val="ImageCaption"/>
+      </w:pPr>
+      <w:r>
+        <w:t xml:space="preserve">Xem hợp đồng — nút Ký / Sửa / Tạo tài liệu</w:t>
+      </w:r>
+    </w:p>
+    <w:p>
+      <w:pPr>
+        <w:pStyle w:val="BodyText"/>
+      </w:pPr>
+      <w:r>
+        <w:rPr>
+          <w:b/>
+          <w:bCs/>
+        </w:rPr>
+        <w:t xml:space="preserve">Bước 5.</w:t>
+      </w:r>
+      <w:r>
+        <w:t xml:space="preserve"> </w:t>
+      </w:r>
+      <w:r>
+        <w:rPr>
+          <w:b/>
+          <w:bCs/>
+        </w:rPr>
+        <w:t xml:space="preserve">In hợp đồng:</w:t>
+      </w:r>
+      <w:r>
+        <w:t xml:space="preserve"> </w:t>
+      </w:r>
+      <w:r>
+        <w:t xml:space="preserve">bấm</w:t>
+      </w:r>
+      <w:r>
+        <w:t xml:space="preserve"> </w:t>
+      </w:r>
+      <w:r>
+        <w:rPr>
+          <w:b/>
+          <w:bCs/>
+        </w:rPr>
+        <w:t xml:space="preserve">Tạo Tài Liệu</w:t>
+      </w:r>
+      <w:r>
+        <w:t xml:space="preserve"> </w:t>
+      </w:r>
+      <w:r>
+        <w:t xml:space="preserve">→ chọn PDF/DOCX →</w:t>
+      </w:r>
+      <w:r>
+        <w:t xml:space="preserve"> </w:t>
+      </w:r>
+      <w:r>
+        <w:rPr>
+          <w:b/>
+          <w:bCs/>
+        </w:rPr>
+        <w:t xml:space="preserve">Tạo</w:t>
+      </w:r>
+      <w:r>
+        <w:t xml:space="preserve"> </w:t>
+      </w:r>
+      <w:r>
+        <w:t xml:space="preserve">→ tải về (giống</w:t>
+      </w:r>
+      <w:r>
+        <w:t xml:space="preserve"> </w:t>
+      </w:r>
+      <w:r>
+        <w:t xml:space="preserve">Bước 5 của Báo giá).</w:t>
+      </w:r>
+    </w:p>
+    <w:bookmarkEnd w:id="57"/>
+    <w:bookmarkStart w:id="64" w:name="cách-tạo-phiếu-tạm-ứng"/>
+    <w:p>
+      <w:pPr>
+        <w:pStyle w:val="Heading2"/>
+      </w:pPr>
+      <w:r>
+        <w:t xml:space="preserve">4.4. Cách tạo phiếu Tạm ứng</w:t>
+      </w:r>
+    </w:p>
+    <w:p>
+      <w:pPr>
+        <w:pStyle w:val="FirstParagraph"/>
+      </w:pPr>
+      <w:r>
+        <w:rPr>
+          <w:b/>
+          <w:bCs/>
+        </w:rPr>
+        <w:t xml:space="preserve">Bước 1.</w:t>
+      </w:r>
+      <w:r>
+        <w:t xml:space="preserve"> </w:t>
+      </w:r>
+      <w:r>
+        <w:t xml:space="preserve">Sau khi</w:t>
+      </w:r>
+      <w:r>
+        <w:t xml:space="preserve"> </w:t>
+      </w:r>
+      <w:r>
+        <w:rPr>
+          <w:b/>
+          <w:bCs/>
+        </w:rPr>
+        <w:t xml:space="preserve">ký hợp đồng</w:t>
+      </w:r>
+      <w:r>
+        <w:t xml:space="preserve">, tại khối</w:t>
+      </w:r>
+      <w:r>
+        <w:t xml:space="preserve"> </w:t>
+      </w:r>
+      <w:r>
+        <w:rPr>
+          <w:b/>
+          <w:bCs/>
+        </w:rPr>
+        <w:t xml:space="preserve">Tạm ứng</w:t>
+      </w:r>
+      <w:r>
+        <w:t xml:space="preserve"> </w:t>
+      </w:r>
+      <w:r>
+        <w:t xml:space="preserve">(hoặc nút</w:t>
+      </w:r>
+      <w:r>
+        <w:t xml:space="preserve"> </w:t>
+      </w:r>
+      <w:r>
+        <w:rPr>
+          <w:b/>
+          <w:bCs/>
+        </w:rPr>
+        <w:t xml:space="preserve">Đề Nghị Thanh Toán</w:t>
+      </w:r>
+      <w:r>
+        <w:t xml:space="preserve">),</w:t>
+      </w:r>
+      <w:r>
+        <w:t xml:space="preserve"> </w:t>
+      </w:r>
+      <w:r>
+        <w:t xml:space="preserve">bấm</w:t>
+      </w:r>
+      <w:r>
+        <w:t xml:space="preserve"> </w:t>
+      </w:r>
+      <w:r>
+        <w:rPr>
+          <w:b/>
+          <w:bCs/>
+        </w:rPr>
+        <w:t xml:space="preserve">Tạo phiếu tạm ứng</w:t>
+      </w:r>
+      <w:r>
+        <w:t xml:space="preserve">.</w:t>
+      </w:r>
+    </w:p>
+    <w:p>
+      <w:pPr>
+        <w:pStyle w:val="BodyText"/>
+      </w:pPr>
+      <w:r>
+        <w:rPr>
+          <w:b/>
+          <w:bCs/>
+        </w:rPr>
+        <w:t xml:space="preserve">Bước 2.</w:t>
+      </w:r>
+      <w:r>
+        <w:t xml:space="preserve"> </w:t>
+      </w:r>
+      <w:r>
+        <w:t xml:space="preserve">Điền:</w:t>
+      </w:r>
+      <w:r>
+        <w:t xml:space="preserve"> </w:t>
+      </w:r>
+      <w:r>
+        <w:rPr>
+          <w:b/>
+          <w:bCs/>
+        </w:rPr>
+        <w:t xml:space="preserve">Số phiếu</w:t>
+      </w:r>
+      <w:r>
+        <w:t xml:space="preserve">,</w:t>
+      </w:r>
+      <w:r>
+        <w:t xml:space="preserve"> </w:t>
+      </w:r>
+      <w:r>
+        <w:rPr>
+          <w:b/>
+          <w:bCs/>
+        </w:rPr>
+        <w:t xml:space="preserve">Ngày lập / Ngày thanh toán</w:t>
+      </w:r>
+      <w:r>
+        <w:t xml:space="preserve">,</w:t>
+      </w:r>
+      <w:r>
+        <w:t xml:space="preserve"> </w:t>
+      </w:r>
+      <w:r>
+        <w:rPr>
+          <w:b/>
+          <w:bCs/>
+        </w:rPr>
+        <w:t xml:space="preserve">% tạm ứng</w:t>
+      </w:r>
+      <w:r>
+        <w:t xml:space="preserve"> </w:t>
+      </w:r>
+      <w:r>
+        <w:t xml:space="preserve">và</w:t>
+      </w:r>
+      <w:r>
+        <w:t xml:space="preserve"> </w:t>
+      </w:r>
+      <w:r>
+        <w:rPr>
+          <w:b/>
+          <w:bCs/>
+        </w:rPr>
+        <w:t xml:space="preserve">số tiền</w:t>
+      </w:r>
+      <w:r>
+        <w:rPr>
+          <w:b/>
+          <w:bCs/>
+        </w:rPr>
+        <w:t xml:space="preserve"> </w:t>
+      </w:r>
+      <w:r>
+        <w:rPr>
+          <w:b/>
+          <w:bCs/>
+        </w:rPr>
+        <w:t xml:space="preserve">tạm ứng</w:t>
+      </w:r>
+      <w:r>
+        <w:t xml:space="preserve"> </w:t>
+      </w:r>
+      <w:r>
+        <w:t xml:space="preserve">(thường 30% giá trị hợp đồng),</w:t>
+      </w:r>
+      <w:r>
+        <w:t xml:space="preserve"> </w:t>
+      </w:r>
+      <w:r>
+        <w:rPr>
+          <w:b/>
+          <w:bCs/>
+        </w:rPr>
+        <w:t xml:space="preserve">hình thức thanh toán</w:t>
+      </w:r>
+      <w:r>
+        <w:t xml:space="preserve">. Bấm</w:t>
+      </w:r>
+      <w:r>
+        <w:t xml:space="preserve"> </w:t>
+      </w:r>
+      <w:r>
+        <w:rPr>
+          <w:b/>
+          <w:bCs/>
+        </w:rPr>
+        <w:t xml:space="preserve">Lưu</w:t>
+      </w:r>
+      <w:r>
+        <w:t xml:space="preserve">.</w:t>
+      </w:r>
+    </w:p>
+    <w:p>
+      <w:pPr>
+        <w:pStyle w:val="CaptionedFigure"/>
+      </w:pPr>
+      <w:r>
+        <w:drawing>
+          <wp:inline>
+            <wp:extent cx="5334000" cy="6667500"/>
+            <wp:effectExtent b="0" l="0" r="0" t="0"/>
+            <wp:docPr descr="Biểu mẫu tạo phiếu thanh toán / tạm ứng" title="" id="59" name="Picture"/>
+            <a:graphic>
+              <a:graphicData uri="http://schemas.openxmlformats.org/drawingml/2006/picture">
+                <pic:pic>
+                  <pic:nvPicPr>
+                    <pic:cNvPr descr="images/04d-tam-ung/01-form-tao.png" id="60" name="Picture"/>
+                    <pic:cNvPicPr>
+                      <a:picLocks noChangeArrowheads="1" noChangeAspect="1"/>
+                    </pic:cNvPicPr>
+                  </pic:nvPicPr>
+                  <pic:blipFill>
+                    <a:blip r:embed="rId58"/>
+                    <a:stretch>
+                      <a:fillRect/>
+                    </a:stretch>
+                  </pic:blipFill>
+                  <pic:spPr bwMode="auto">
+                    <a:xfrm>
+                      <a:off x="0" y="0"/>
+                      <a:ext cx="5334000" cy="6667500"/>
+                    </a:xfrm>
+                    <a:prstGeom prst="rect">
+                      <a:avLst/>
+                    </a:prstGeom>
+                    <a:noFill/>
+                    <a:ln w="9525">
+                      <a:noFill/>
+                      <a:headEnd/>
+                      <a:tailEnd/>
+                    </a:ln>
+                  </pic:spPr>
+                </pic:pic>
+              </a:graphicData>
+            </a:graphic>
+          </wp:inline>
+        </w:drawing>
+      </w:r>
+    </w:p>
+    <w:p>
+      <w:pPr>
+        <w:pStyle w:val="ImageCaption"/>
+      </w:pPr>
+      <w:r>
+        <w:t xml:space="preserve">Biểu mẫu tạo phiếu thanh toán / tạm ứng</w:t>
+      </w:r>
+    </w:p>
+    <w:p>
+      <w:pPr>
+        <w:pStyle w:val="BodyText"/>
+      </w:pPr>
+      <w:r>
+        <w:rPr>
+          <w:b/>
+          <w:bCs/>
+        </w:rPr>
+        <w:t xml:space="preserve">Bước 3.</w:t>
+      </w:r>
+      <w:r>
+        <w:t xml:space="preserve"> </w:t>
+      </w:r>
+      <w:r>
+        <w:t xml:space="preserve">Ở trang</w:t>
+      </w:r>
+      <w:r>
+        <w:t xml:space="preserve"> </w:t>
+      </w:r>
+      <w:r>
+        <w:rPr>
+          <w:b/>
+          <w:bCs/>
+        </w:rPr>
+        <w:t xml:space="preserve">xem phiếu</w:t>
+      </w:r>
+      <w:r>
+        <w:t xml:space="preserve">, bấm</w:t>
+      </w:r>
+      <w:r>
+        <w:t xml:space="preserve"> </w:t>
+      </w:r>
+      <w:r>
+        <w:rPr>
+          <w:b/>
+          <w:bCs/>
+        </w:rPr>
+        <w:t xml:space="preserve">Xác nhận</w:t>
+      </w:r>
+      <w:r>
+        <w:t xml:space="preserve"> </w:t>
+      </w:r>
+      <w:r>
+        <w:t xml:space="preserve">khi đã nhận được tiền tạm ứng. Sau khi</w:t>
+      </w:r>
+      <w:r>
+        <w:t xml:space="preserve"> </w:t>
+      </w:r>
+      <w:r>
+        <w:t xml:space="preserve">xác nhận, mở khóa bước</w:t>
+      </w:r>
+      <w:r>
+        <w:t xml:space="preserve"> </w:t>
+      </w:r>
+      <w:r>
+        <w:rPr>
+          <w:b/>
+          <w:bCs/>
+        </w:rPr>
+        <w:t xml:space="preserve">Bàn giao</w:t>
+      </w:r>
+      <w:r>
+        <w:t xml:space="preserve">.</w:t>
+      </w:r>
+    </w:p>
+    <w:p>
+      <w:pPr>
+        <w:pStyle w:val="CaptionedFigure"/>
+      </w:pPr>
+      <w:r>
+        <w:drawing>
+          <wp:inline>
+            <wp:extent cx="5334000" cy="5971116"/>
+            <wp:effectExtent b="0" l="0" r="0" t="0"/>
+            <wp:docPr descr="Xem phiếu tạm ứng — nút Xác nhận / Sửa / In" title="" id="62" name="Picture"/>
+            <a:graphic>
+              <a:graphicData uri="http://schemas.openxmlformats.org/drawingml/2006/picture">
+                <pic:pic>
+                  <pic:nvPicPr>
+                    <pic:cNvPr descr="images/04d-tam-ung/02-xem-xac-nhan.png" id="63" name="Picture"/>
+                    <pic:cNvPicPr>
+                      <a:picLocks noChangeArrowheads="1" noChangeAspect="1"/>
+                    </pic:cNvPicPr>
+                  </pic:nvPicPr>
+                  <pic:blipFill>
+                    <a:blip r:embed="rId61"/>
+                    <a:stretch>
+                      <a:fillRect/>
+                    </a:stretch>
+                  </pic:blipFill>
+                  <pic:spPr bwMode="auto">
+                    <a:xfrm>
+                      <a:off x="0" y="0"/>
+                      <a:ext cx="5334000" cy="5971116"/>
+                    </a:xfrm>
+                    <a:prstGeom prst="rect">
+                      <a:avLst/>
+                    </a:prstGeom>
+                    <a:noFill/>
+                    <a:ln w="9525">
+                      <a:noFill/>
+                      <a:headEnd/>
+                      <a:tailEnd/>
+                    </a:ln>
+                  </pic:spPr>
+                </pic:pic>
+              </a:graphicData>
+            </a:graphic>
+          </wp:inline>
+        </w:drawing>
+      </w:r>
+    </w:p>
+    <w:p>
+      <w:pPr>
+        <w:pStyle w:val="ImageCaption"/>
+      </w:pPr>
+      <w:r>
+        <w:t xml:space="preserve">Xem phiếu tạm ứng — nút Xác nhận / Sửa / In</w:t>
+      </w:r>
+    </w:p>
+    <w:p>
+      <w:pPr>
+        <w:pStyle w:val="BodyText"/>
+      </w:pPr>
+      <w:r>
+        <w:rPr>
+          <w:b/>
+          <w:bCs/>
+        </w:rPr>
+        <w:t xml:space="preserve">Bước 4.</w:t>
+      </w:r>
+      <w:r>
+        <w:t xml:space="preserve"> </w:t>
+      </w:r>
+      <w:r>
+        <w:rPr>
+          <w:b/>
+          <w:bCs/>
+        </w:rPr>
+        <w:t xml:space="preserve">In giấy đề nghị tạm ứng:</w:t>
+      </w:r>
+      <w:r>
+        <w:t xml:space="preserve"> </w:t>
+      </w:r>
+      <w:r>
+        <w:t xml:space="preserve">bấm</w:t>
+      </w:r>
+      <w:r>
+        <w:t xml:space="preserve"> </w:t>
+      </w:r>
+      <w:r>
+        <w:rPr>
+          <w:b/>
+          <w:bCs/>
+        </w:rPr>
+        <w:t xml:space="preserve">Tạo Tài Liệu</w:t>
+      </w:r>
+      <w:r>
+        <w:t xml:space="preserve"> </w:t>
+      </w:r>
+      <w:r>
+        <w:t xml:space="preserve">→ PDF/DOCX →</w:t>
+      </w:r>
+      <w:r>
+        <w:t xml:space="preserve"> </w:t>
+      </w:r>
+      <w:r>
+        <w:rPr>
+          <w:b/>
+          <w:bCs/>
+        </w:rPr>
+        <w:t xml:space="preserve">Tạo</w:t>
+      </w:r>
+      <w:r>
+        <w:t xml:space="preserve">.</w:t>
+      </w:r>
+    </w:p>
+    <w:bookmarkEnd w:id="64"/>
+    <w:bookmarkStart w:id="71" w:name="cách-tạo-biên-bản-bàn-giao"/>
+    <w:p>
+      <w:pPr>
+        <w:pStyle w:val="Heading2"/>
+      </w:pPr>
+      <w:r>
+        <w:t xml:space="preserve">4.5. Cách tạo Biên bản bàn giao</w:t>
+      </w:r>
+    </w:p>
+    <w:p>
+      <w:pPr>
+        <w:pStyle w:val="FirstParagraph"/>
+      </w:pPr>
+      <w:r>
+        <w:rPr>
+          <w:b/>
+          <w:bCs/>
+        </w:rPr>
+        <w:t xml:space="preserve">Bước 1.</w:t>
+      </w:r>
+      <w:r>
+        <w:t xml:space="preserve"> </w:t>
+      </w:r>
+      <w:r>
+        <w:t xml:space="preserve">Sau khi</w:t>
+      </w:r>
+      <w:r>
+        <w:t xml:space="preserve"> </w:t>
+      </w:r>
+      <w:r>
+        <w:rPr>
+          <w:b/>
+          <w:bCs/>
+        </w:rPr>
+        <w:t xml:space="preserve">xác nhận tạm ứng</w:t>
+      </w:r>
+      <w:r>
+        <w:t xml:space="preserve">, tại khối</w:t>
+      </w:r>
+      <w:r>
+        <w:t xml:space="preserve"> </w:t>
+      </w:r>
+      <w:r>
+        <w:rPr>
+          <w:b/>
+          <w:bCs/>
+        </w:rPr>
+        <w:t xml:space="preserve">Biên bản bàn giao</w:t>
+      </w:r>
+      <w:r>
+        <w:t xml:space="preserve">, bấm</w:t>
+      </w:r>
+      <w:r>
+        <w:t xml:space="preserve"> </w:t>
+      </w:r>
+      <w:r>
+        <w:rPr>
+          <w:b/>
+          <w:bCs/>
+        </w:rPr>
+        <w:t xml:space="preserve">Tạo biên</w:t>
+      </w:r>
+      <w:r>
+        <w:rPr>
+          <w:b/>
+          <w:bCs/>
+        </w:rPr>
+        <w:t xml:space="preserve"> </w:t>
+      </w:r>
+      <w:r>
+        <w:rPr>
+          <w:b/>
+          <w:bCs/>
+        </w:rPr>
+        <w:t xml:space="preserve">bản bàn giao</w:t>
+      </w:r>
+      <w:r>
+        <w:t xml:space="preserve">.</w:t>
+      </w:r>
+    </w:p>
+    <w:p>
+      <w:pPr>
+        <w:pStyle w:val="BodyText"/>
+      </w:pPr>
+      <w:r>
+        <w:rPr>
+          <w:b/>
+          <w:bCs/>
+        </w:rPr>
+        <w:t xml:space="preserve">Bước 2.</w:t>
+      </w:r>
+      <w:r>
+        <w:t xml:space="preserve"> </w:t>
+      </w:r>
+      <w:r>
+        <w:t xml:space="preserve">Điền:</w:t>
+      </w:r>
+      <w:r>
+        <w:t xml:space="preserve"> </w:t>
+      </w:r>
+      <w:r>
+        <w:rPr>
+          <w:b/>
+          <w:bCs/>
+        </w:rPr>
+        <w:t xml:space="preserve">Số biên bản</w:t>
+      </w:r>
+      <w:r>
+        <w:t xml:space="preserve">,</w:t>
+      </w:r>
+      <w:r>
+        <w:t xml:space="preserve"> </w:t>
+      </w:r>
+      <w:r>
+        <w:rPr>
+          <w:b/>
+          <w:bCs/>
+        </w:rPr>
+        <w:t xml:space="preserve">Ngày lập</w:t>
+      </w:r>
+      <w:r>
+        <w:t xml:space="preserve">,</w:t>
+      </w:r>
+      <w:r>
+        <w:t xml:space="preserve"> </w:t>
+      </w:r>
+      <w:r>
+        <w:rPr>
+          <w:b/>
+          <w:bCs/>
+        </w:rPr>
+        <w:t xml:space="preserve">Ngày bàn giao</w:t>
+      </w:r>
+      <w:r>
+        <w:t xml:space="preserve">,</w:t>
+      </w:r>
+      <w:r>
+        <w:t xml:space="preserve"> </w:t>
+      </w:r>
+      <w:r>
+        <w:rPr>
+          <w:b/>
+          <w:bCs/>
+        </w:rPr>
+        <w:t xml:space="preserve">Địa điểm</w:t>
+      </w:r>
+      <w:r>
+        <w:t xml:space="preserve">,</w:t>
+      </w:r>
+      <w:r>
+        <w:t xml:space="preserve"> </w:t>
+      </w:r>
+      <w:r>
+        <w:rPr>
+          <w:b/>
+          <w:bCs/>
+        </w:rPr>
+        <w:t xml:space="preserve">giờ bắt</w:t>
+      </w:r>
+      <w:r>
+        <w:rPr>
+          <w:b/>
+          <w:bCs/>
+        </w:rPr>
+        <w:t xml:space="preserve"> </w:t>
+      </w:r>
+      <w:r>
+        <w:rPr>
+          <w:b/>
+          <w:bCs/>
+        </w:rPr>
+        <w:t xml:space="preserve">đầu/kết thúc</w:t>
+      </w:r>
+      <w:r>
+        <w:t xml:space="preserve">,</w:t>
+      </w:r>
+      <w:r>
+        <w:t xml:space="preserve"> </w:t>
+      </w:r>
+      <w:r>
+        <w:rPr>
+          <w:b/>
+          <w:bCs/>
+        </w:rPr>
+        <w:t xml:space="preserve">người đại diện</w:t>
+      </w:r>
+      <w:r>
+        <w:t xml:space="preserve"> </w:t>
+      </w:r>
+      <w:r>
+        <w:t xml:space="preserve">hai bên,</w:t>
+      </w:r>
+      <w:r>
+        <w:t xml:space="preserve"> </w:t>
+      </w:r>
+      <w:r>
+        <w:rPr>
+          <w:b/>
+          <w:bCs/>
+        </w:rPr>
+        <w:t xml:space="preserve">tình trạng sản phẩm</w:t>
+      </w:r>
+      <w:r>
+        <w:t xml:space="preserve">. Với mỗi hạng mục, ghi</w:t>
+      </w:r>
+      <w:r>
+        <w:t xml:space="preserve"> </w:t>
+      </w:r>
+      <w:r>
+        <w:rPr>
+          <w:b/>
+          <w:bCs/>
+        </w:rPr>
+        <w:t xml:space="preserve">SL giao / SL nghiệm thu</w:t>
+      </w:r>
+      <w:r>
+        <w:t xml:space="preserve"> </w:t>
+      </w:r>
+      <w:r>
+        <w:t xml:space="preserve">và</w:t>
+      </w:r>
+      <w:r>
+        <w:t xml:space="preserve"> </w:t>
+      </w:r>
+      <w:r>
+        <w:rPr>
+          <w:b/>
+          <w:bCs/>
+        </w:rPr>
+        <w:t xml:space="preserve">Đạt / Không đạt</w:t>
+      </w:r>
+      <w:r>
+        <w:t xml:space="preserve">. Bấm</w:t>
+      </w:r>
+      <w:r>
+        <w:t xml:space="preserve"> </w:t>
+      </w:r>
+      <w:r>
+        <w:rPr>
+          <w:b/>
+          <w:bCs/>
+        </w:rPr>
+        <w:t xml:space="preserve">Lưu</w:t>
+      </w:r>
+      <w:r>
+        <w:t xml:space="preserve">.</w:t>
+      </w:r>
+    </w:p>
+    <w:p>
+      <w:pPr>
+        <w:pStyle w:val="CaptionedFigure"/>
+      </w:pPr>
+      <w:r>
+        <w:drawing>
+          <wp:inline>
+            <wp:extent cx="5334000" cy="5604404"/>
+            <wp:effectExtent b="0" l="0" r="0" t="0"/>
+            <wp:docPr descr="Biểu mẫu tạo biên bản bàn giao" title="" id="66" name="Picture"/>
+            <a:graphic>
+              <a:graphicData uri="http://schemas.openxmlformats.org/drawingml/2006/picture">
+                <pic:pic>
+                  <pic:nvPicPr>
+                    <pic:cNvPr descr="images/04e-ban-giao/01-form-tao.png" id="67" name="Picture"/>
+                    <pic:cNvPicPr>
+                      <a:picLocks noChangeArrowheads="1" noChangeAspect="1"/>
+                    </pic:cNvPicPr>
+                  </pic:nvPicPr>
+                  <pic:blipFill>
+                    <a:blip r:embed="rId65"/>
+                    <a:stretch>
+                      <a:fillRect/>
+                    </a:stretch>
+                  </pic:blipFill>
+                  <pic:spPr bwMode="auto">
+                    <a:xfrm>
+                      <a:off x="0" y="0"/>
+                      <a:ext cx="5334000" cy="5604404"/>
+                    </a:xfrm>
+                    <a:prstGeom prst="rect">
+                      <a:avLst/>
+                    </a:prstGeom>
+                    <a:noFill/>
+                    <a:ln w="9525">
+                      <a:noFill/>
+                      <a:headEnd/>
+                      <a:tailEnd/>
+                    </a:ln>
+                  </pic:spPr>
+                </pic:pic>
+              </a:graphicData>
+            </a:graphic>
+          </wp:inline>
+        </w:drawing>
+      </w:r>
+    </w:p>
+    <w:p>
+      <w:pPr>
+        <w:pStyle w:val="ImageCaption"/>
+      </w:pPr>
+      <w:r>
+        <w:t xml:space="preserve">Biểu mẫu tạo biên bản bàn giao</w:t>
+      </w:r>
+    </w:p>
+    <w:p>
+      <w:pPr>
+        <w:pStyle w:val="BodyText"/>
+      </w:pPr>
+      <w:r>
+        <w:rPr>
+          <w:b/>
+          <w:bCs/>
+        </w:rPr>
+        <w:t xml:space="preserve">Bước 3.</w:t>
+      </w:r>
+      <w:r>
+        <w:t xml:space="preserve"> </w:t>
+      </w:r>
+      <w:r>
+        <w:t xml:space="preserve">Ở trang</w:t>
+      </w:r>
+      <w:r>
+        <w:t xml:space="preserve"> </w:t>
+      </w:r>
+      <w:r>
+        <w:rPr>
+          <w:b/>
+          <w:bCs/>
+        </w:rPr>
+        <w:t xml:space="preserve">xem biên bản</w:t>
+      </w:r>
+      <w:r>
+        <w:t xml:space="preserve">, bấm</w:t>
+      </w:r>
+      <w:r>
+        <w:t xml:space="preserve"> </w:t>
+      </w:r>
+      <w:r>
+        <w:rPr>
+          <w:b/>
+          <w:bCs/>
+        </w:rPr>
+        <w:t xml:space="preserve">Xác nhận</w:t>
+      </w:r>
+      <w:r>
+        <w:t xml:space="preserve"> </w:t>
+      </w:r>
+      <w:r>
+        <w:t xml:space="preserve">khi khách đã nhận hàng. Sau khi xác</w:t>
+      </w:r>
+      <w:r>
+        <w:t xml:space="preserve"> </w:t>
+      </w:r>
+      <w:r>
+        <w:t xml:space="preserve">nhận, mở khóa bước</w:t>
+      </w:r>
+      <w:r>
+        <w:t xml:space="preserve"> </w:t>
+      </w:r>
+      <w:r>
+        <w:rPr>
+          <w:b/>
+          <w:bCs/>
+        </w:rPr>
+        <w:t xml:space="preserve">Thanh toán cuối</w:t>
+      </w:r>
+      <w:r>
+        <w:t xml:space="preserve">.</w:t>
+      </w:r>
+    </w:p>
+    <w:p>
+      <w:pPr>
+        <w:pStyle w:val="CaptionedFigure"/>
+      </w:pPr>
+      <w:r>
+        <w:drawing>
+          <wp:inline>
+            <wp:extent cx="5334000" cy="5059891"/>
+            <wp:effectExtent b="0" l="0" r="0" t="0"/>
+            <wp:docPr descr="Xem biên bản bàn giao — nút Xác nhận / Sửa / In" title="" id="69" name="Picture"/>
+            <a:graphic>
+              <a:graphicData uri="http://schemas.openxmlformats.org/drawingml/2006/picture">
+                <pic:pic>
+                  <pic:nvPicPr>
+                    <pic:cNvPr descr="images/04e-ban-giao/02-xem-xac-nhan.png" id="70" name="Picture"/>
+                    <pic:cNvPicPr>
+                      <a:picLocks noChangeArrowheads="1" noChangeAspect="1"/>
+                    </pic:cNvPicPr>
+                  </pic:nvPicPr>
+                  <pic:blipFill>
+                    <a:blip r:embed="rId68"/>
+                    <a:stretch>
+                      <a:fillRect/>
+                    </a:stretch>
+                  </pic:blipFill>
+                  <pic:spPr bwMode="auto">
+                    <a:xfrm>
+                      <a:off x="0" y="0"/>
+                      <a:ext cx="5334000" cy="5059891"/>
+                    </a:xfrm>
+                    <a:prstGeom prst="rect">
+                      <a:avLst/>
+                    </a:prstGeom>
+                    <a:noFill/>
+                    <a:ln w="9525">
+                      <a:noFill/>
+                      <a:headEnd/>
+                      <a:tailEnd/>
+                    </a:ln>
+                  </pic:spPr>
+                </pic:pic>
+              </a:graphicData>
+            </a:graphic>
+          </wp:inline>
+        </w:drawing>
+      </w:r>
+    </w:p>
+    <w:p>
+      <w:pPr>
+        <w:pStyle w:val="ImageCaption"/>
+      </w:pPr>
+      <w:r>
+        <w:t xml:space="preserve">Xem biên bản bàn giao — nút Xác nhận / Sửa / In</w:t>
+      </w:r>
+    </w:p>
+    <w:p>
+      <w:pPr>
+        <w:pStyle w:val="BodyText"/>
+      </w:pPr>
+      <w:r>
+        <w:rPr>
+          <w:b/>
+          <w:bCs/>
+        </w:rPr>
+        <w:t xml:space="preserve">Bước 4.</w:t>
+      </w:r>
+      <w:r>
+        <w:t xml:space="preserve"> </w:t>
+      </w:r>
+      <w:r>
+        <w:rPr>
+          <w:b/>
+          <w:bCs/>
+        </w:rPr>
+        <w:t xml:space="preserve">In biên bản:</w:t>
+      </w:r>
+      <w:r>
+        <w:t xml:space="preserve"> </w:t>
+      </w:r>
+      <w:r>
+        <w:t xml:space="preserve">bấm</w:t>
+      </w:r>
+      <w:r>
+        <w:t xml:space="preserve"> </w:t>
+      </w:r>
+      <w:r>
+        <w:rPr>
+          <w:b/>
+          <w:bCs/>
+        </w:rPr>
+        <w:t xml:space="preserve">Tạo Tài Liệu</w:t>
+      </w:r>
+      <w:r>
+        <w:t xml:space="preserve"> </w:t>
+      </w:r>
+      <w:r>
+        <w:t xml:space="preserve">→ PDF/DOCX →</w:t>
+      </w:r>
+      <w:r>
+        <w:t xml:space="preserve"> </w:t>
+      </w:r>
+      <w:r>
+        <w:rPr>
+          <w:b/>
+          <w:bCs/>
+        </w:rPr>
+        <w:t xml:space="preserve">Tạo</w:t>
+      </w:r>
+      <w:r>
+        <w:t xml:space="preserve">.</w:t>
+      </w:r>
+    </w:p>
+    <w:bookmarkEnd w:id="71"/>
+    <w:bookmarkStart w:id="75" w:name="cách-tạo-phiếu-thanh-toán-cuối"/>
+    <w:p>
+      <w:pPr>
+        <w:pStyle w:val="Heading2"/>
+      </w:pPr>
+      <w:r>
+        <w:t xml:space="preserve">4.6. Cách tạo phiếu Thanh toán cuối</w:t>
+      </w:r>
+    </w:p>
+    <w:p>
+      <w:pPr>
+        <w:pStyle w:val="FirstParagraph"/>
+      </w:pPr>
+      <w:r>
+        <w:rPr>
+          <w:b/>
+          <w:bCs/>
+        </w:rPr>
+        <w:t xml:space="preserve">Bước 1.</w:t>
+      </w:r>
+      <w:r>
+        <w:t xml:space="preserve"> </w:t>
+      </w:r>
+      <w:r>
+        <w:t xml:space="preserve">Sau khi</w:t>
+      </w:r>
+      <w:r>
+        <w:t xml:space="preserve"> </w:t>
+      </w:r>
+      <w:r>
+        <w:rPr>
+          <w:b/>
+          <w:bCs/>
+        </w:rPr>
+        <w:t xml:space="preserve">xác nhận bàn giao</w:t>
+      </w:r>
+      <w:r>
+        <w:t xml:space="preserve">, bấm</w:t>
+      </w:r>
+      <w:r>
+        <w:t xml:space="preserve"> </w:t>
+      </w:r>
+      <w:r>
+        <w:rPr>
+          <w:b/>
+          <w:bCs/>
+        </w:rPr>
+        <w:t xml:space="preserve">Tạo Biên Bản Thanh Toán Cuối</w:t>
+      </w:r>
+      <w:r>
+        <w:t xml:space="preserve"> </w:t>
+      </w:r>
+      <w:r>
+        <w:t xml:space="preserve">(nút xanh ở</w:t>
+      </w:r>
+      <w:r>
+        <w:t xml:space="preserve"> </w:t>
+      </w:r>
+      <w:r>
+        <w:t xml:space="preserve">khối</w:t>
+      </w:r>
+      <w:r>
+        <w:t xml:space="preserve"> </w:t>
+      </w:r>
+      <w:r>
+        <w:rPr>
+          <w:b/>
+          <w:bCs/>
+        </w:rPr>
+        <w:t xml:space="preserve">Thao Tác Nhanh</w:t>
+      </w:r>
+      <w:r>
+        <w:t xml:space="preserve"> </w:t>
+      </w:r>
+      <w:r>
+        <w:t xml:space="preserve">trên trang đơn hàng). Biểu mẫu giống phiếu tạm ứng nhưng</w:t>
+      </w:r>
+      <w:r>
+        <w:t xml:space="preserve"> </w:t>
+      </w:r>
+      <w:r>
+        <w:rPr>
+          <w:b/>
+          <w:bCs/>
+        </w:rPr>
+        <w:t xml:space="preserve">loại =</w:t>
+      </w:r>
+      <w:r>
+        <w:rPr>
+          <w:b/>
+          <w:bCs/>
+        </w:rPr>
+        <w:t xml:space="preserve"> </w:t>
+      </w:r>
+      <w:r>
+        <w:rPr>
+          <w:b/>
+          <w:bCs/>
+        </w:rPr>
+        <w:t xml:space="preserve">Thanh toán cuối</w:t>
+      </w:r>
+      <w:r>
+        <w:t xml:space="preserve">; số tiền là</w:t>
+      </w:r>
+      <w:r>
+        <w:t xml:space="preserve"> </w:t>
+      </w:r>
+      <w:r>
+        <w:rPr>
+          <w:b/>
+          <w:bCs/>
+        </w:rPr>
+        <w:t xml:space="preserve">phần còn lại phải trả</w:t>
+      </w:r>
+      <w:r>
+        <w:t xml:space="preserve">.</w:t>
+      </w:r>
+    </w:p>
+    <w:p>
+      <w:pPr>
+        <w:pStyle w:val="BodyText"/>
+      </w:pPr>
+      <w:r>
+        <w:rPr>
+          <w:b/>
+          <w:bCs/>
+        </w:rPr>
+        <w:t xml:space="preserve">Bước 2.</w:t>
+      </w:r>
+      <w:r>
+        <w:t xml:space="preserve"> </w:t>
+      </w:r>
+      <w:r>
+        <w:t xml:space="preserve">Ở trang</w:t>
+      </w:r>
+      <w:r>
+        <w:t xml:space="preserve"> </w:t>
+      </w:r>
+      <w:r>
+        <w:rPr>
+          <w:b/>
+          <w:bCs/>
+        </w:rPr>
+        <w:t xml:space="preserve">xem phiếu thanh toán cuối</w:t>
+      </w:r>
+      <w:r>
+        <w:t xml:space="preserve">, kiểm tra:</w:t>
+      </w:r>
+      <w:r>
+        <w:t xml:space="preserve"> </w:t>
+      </w:r>
+      <w:r>
+        <w:rPr>
+          <w:i/>
+          <w:iCs/>
+        </w:rPr>
+        <w:t xml:space="preserve">Tổng giá trị – Đã tạm ứng =</w:t>
+      </w:r>
+      <w:r>
+        <w:rPr>
+          <w:i/>
+          <w:iCs/>
+        </w:rPr>
+        <w:t xml:space="preserve"> </w:t>
+      </w:r>
+      <w:r>
+        <w:rPr>
+          <w:i/>
+          <w:iCs/>
+        </w:rPr>
+        <w:t xml:space="preserve">Còn lại phải thanh toán</w:t>
+      </w:r>
+      <w:r>
+        <w:t xml:space="preserve">. Bấm</w:t>
+      </w:r>
+      <w:r>
+        <w:t xml:space="preserve"> </w:t>
+      </w:r>
+      <w:r>
+        <w:rPr>
+          <w:b/>
+          <w:bCs/>
+        </w:rPr>
+        <w:t xml:space="preserve">Xác nhận</w:t>
+      </w:r>
+      <w:r>
+        <w:t xml:space="preserve"> </w:t>
+      </w:r>
+      <w:r>
+        <w:t xml:space="preserve">khi thu đủ; đơn hàng chuyển</w:t>
+      </w:r>
+      <w:r>
+        <w:t xml:space="preserve"> </w:t>
+      </w:r>
+      <w:r>
+        <w:rPr>
+          <w:b/>
+          <w:bCs/>
+        </w:rPr>
+        <w:t xml:space="preserve">Hoàn tất</w:t>
+      </w:r>
+      <w:r>
+        <w:t xml:space="preserve">.</w:t>
+      </w:r>
+    </w:p>
+    <w:p>
+      <w:pPr>
+        <w:pStyle w:val="CaptionedFigure"/>
+      </w:pPr>
+      <w:r>
+        <w:drawing>
+          <wp:inline>
+            <wp:extent cx="5334000" cy="5971116"/>
+            <wp:effectExtent b="0" l="0" r="0" t="0"/>
+            <wp:docPr descr="Xem phiếu thanh toán cuối" title="" id="73" name="Picture"/>
+            <a:graphic>
+              <a:graphicData uri="http://schemas.openxmlformats.org/drawingml/2006/picture">
+                <pic:pic>
+                  <pic:nvPicPr>
+                    <pic:cNvPr descr="images/04f-thanh-toan/01-xem.png" id="74" name="Picture"/>
+                    <pic:cNvPicPr>
+                      <a:picLocks noChangeArrowheads="1" noChangeAspect="1"/>
+                    </pic:cNvPicPr>
+                  </pic:nvPicPr>
+                  <pic:blipFill>
+                    <a:blip r:embed="rId72"/>
+                    <a:stretch>
+                      <a:fillRect/>
+                    </a:stretch>
+                  </pic:blipFill>
+                  <pic:spPr bwMode="auto">
+                    <a:xfrm>
+                      <a:off x="0" y="0"/>
+                      <a:ext cx="5334000" cy="5971116"/>
+                    </a:xfrm>
+                    <a:prstGeom prst="rect">
+                      <a:avLst/>
+                    </a:prstGeom>
+                    <a:noFill/>
+                    <a:ln w="9525">
+                      <a:noFill/>
+                      <a:headEnd/>
+                      <a:tailEnd/>
+                    </a:ln>
+                  </pic:spPr>
+                </pic:pic>
+              </a:graphicData>
+            </a:graphic>
+          </wp:inline>
+        </w:drawing>
+      </w:r>
+    </w:p>
+    <w:p>
+      <w:pPr>
+        <w:pStyle w:val="ImageCaption"/>
+      </w:pPr>
+      <w:r>
+        <w:t xml:space="preserve">Xem phiếu thanh toán cuối</w:t>
+      </w:r>
+    </w:p>
+    <w:p>
+      <w:pPr>
+        <w:pStyle w:val="BodyText"/>
+      </w:pPr>
+      <w:r>
+        <w:rPr>
+          <w:b/>
+          <w:bCs/>
+        </w:rPr>
+        <w:t xml:space="preserve">Bước 3.</w:t>
+      </w:r>
+      <w:r>
+        <w:t xml:space="preserve"> </w:t>
+      </w:r>
+      <w:r>
+        <w:rPr>
+          <w:b/>
+          <w:bCs/>
+        </w:rPr>
+        <w:t xml:space="preserve">In giấy đề nghị thanh toán:</w:t>
+      </w:r>
+      <w:r>
+        <w:t xml:space="preserve"> </w:t>
+      </w:r>
+      <w:r>
+        <w:t xml:space="preserve">bấm</w:t>
+      </w:r>
+      <w:r>
+        <w:t xml:space="preserve"> </w:t>
+      </w:r>
+      <w:r>
+        <w:rPr>
+          <w:b/>
+          <w:bCs/>
+        </w:rPr>
+        <w:t xml:space="preserve">Tạo Tài Liệu</w:t>
+      </w:r>
+      <w:r>
+        <w:t xml:space="preserve"> </w:t>
+      </w:r>
+      <w:r>
+        <w:t xml:space="preserve">→ PDF/DOCX →</w:t>
+      </w:r>
+      <w:r>
+        <w:t xml:space="preserve"> </w:t>
+      </w:r>
+      <w:r>
+        <w:rPr>
+          <w:b/>
+          <w:bCs/>
+        </w:rPr>
+        <w:t xml:space="preserve">Tạo</w:t>
+      </w:r>
+      <w:r>
+        <w:t xml:space="preserve">.</w:t>
+      </w:r>
+    </w:p>
+    <w:bookmarkEnd w:id="75"/>
+    <w:bookmarkStart w:id="79" w:name="toàn-cảnh-tiến-trình-trên-trang-đơn-hàng"/>
+    <w:p>
+      <w:pPr>
+        <w:pStyle w:val="Heading2"/>
+      </w:pPr>
+      <w:r>
+        <w:t xml:space="preserve">4.7. Toàn cảnh tiến trình trên trang đơn hàng</w:t>
+      </w:r>
+    </w:p>
+    <w:p>
+      <w:pPr>
+        <w:pStyle w:val="FirstParagraph"/>
+      </w:pPr>
+      <w:r>
+        <w:t xml:space="preserve">Khi đã đủ chứng từ, trang chi tiết đơn hàng hiển thị</w:t>
+      </w:r>
+      <w:r>
+        <w:t xml:space="preserve"> </w:t>
+      </w:r>
+      <w:r>
+        <w:rPr>
+          <w:b/>
+          <w:bCs/>
+        </w:rPr>
+        <w:t xml:space="preserve">toàn bộ tiến trình</w:t>
+      </w:r>
+      <w:r>
+        <w:t xml:space="preserve"> </w:t>
+      </w:r>
+      <w:r>
+        <w:t xml:space="preserve">với trạng thái</w:t>
+      </w:r>
+      <w:r>
+        <w:t xml:space="preserve"> </w:t>
+      </w:r>
+      <w:r>
+        <w:t xml:space="preserve">từng bước (Đã duyệt / Đã ký / Đã xác nhận…) và bảng</w:t>
+      </w:r>
+      <w:r>
+        <w:t xml:space="preserve"> </w:t>
+      </w:r>
+      <w:r>
+        <w:rPr>
+          <w:b/>
+          <w:bCs/>
+        </w:rPr>
+        <w:t xml:space="preserve">Trạng thái</w:t>
+      </w:r>
+      <w:r>
+        <w:t xml:space="preserve"> </w:t>
+      </w:r>
+      <w:r>
+        <w:t xml:space="preserve">tổng hợp bên phải. Mỗi</w:t>
+      </w:r>
+      <w:r>
+        <w:t xml:space="preserve"> </w:t>
+      </w:r>
+      <w:r>
+        <w:t xml:space="preserve">dòng chứng từ có nút</w:t>
+      </w:r>
+      <w:r>
+        <w:t xml:space="preserve"> </w:t>
+      </w:r>
+      <w:r>
+        <w:rPr>
+          <w:b/>
+          <w:bCs/>
+        </w:rPr>
+        <w:t xml:space="preserve">Xem</w:t>
+      </w:r>
+      <w:r>
+        <w:t xml:space="preserve"> </w:t>
+      </w:r>
+      <w:r>
+        <w:t xml:space="preserve">và</w:t>
+      </w:r>
+      <w:r>
+        <w:t xml:space="preserve"> </w:t>
+      </w:r>
+      <w:r>
+        <w:rPr>
+          <w:b/>
+          <w:bCs/>
+        </w:rPr>
+        <w:t xml:space="preserve">Tạo tài liệu (In)</w:t>
+      </w:r>
+      <w:r>
+        <w:t xml:space="preserve">.</w:t>
+      </w:r>
+    </w:p>
+    <w:p>
+      <w:pPr>
+        <w:pStyle w:val="CaptionedFigure"/>
+      </w:pPr>
+      <w:r>
+        <w:drawing>
+          <wp:inline>
+            <wp:extent cx="5334000" cy="5956300"/>
+            <wp:effectExtent b="0" l="0" r="0" t="0"/>
+            <wp:docPr descr="Chi tiết đơn hàng đầy đủ — tiến trình &amp; trạng thái" title="" id="77" name="Picture"/>
+            <a:graphic>
+              <a:graphicData uri="http://schemas.openxmlformats.org/drawingml/2006/picture">
+                <pic:pic>
+                  <pic:nvPicPr>
+                    <pic:cNvPr descr="images/04-don-hang/04-chi-tiet-day-du.png" id="78" name="Picture"/>
+                    <pic:cNvPicPr>
+                      <a:picLocks noChangeArrowheads="1" noChangeAspect="1"/>
+                    </pic:cNvPicPr>
+                  </pic:nvPicPr>
+                  <pic:blipFill>
+                    <a:blip r:embed="rId76"/>
                     <a:stretch>
                       <a:fillRect/>
                     </a:stretch>
@@ -1417,7 +4146,7 @@
         <w:pStyle w:val="ImageCaption"/>
       </w:pPr>
       <w:r>
-        <w:t xml:space="preserve">Chi tiết đơn hàng và tiến trình chứng từ</w:t>
+        <w:t xml:space="preserve">Chi tiết đơn hàng đầy đủ — tiến trình &amp; trạng thái</w:t>
       </w:r>
     </w:p>
     <w:p>
@@ -1435,31 +4164,31 @@
         <w:t xml:space="preserve"> </w:t>
       </w:r>
       <w:r>
-        <w:t xml:space="preserve">phần mềm in được</w:t>
-      </w:r>
-      <w:r>
-        <w:t xml:space="preserve"> </w:t>
-      </w:r>
-      <w:r>
-        <w:rPr>
-          <w:b/>
-          <w:bCs/>
-        </w:rPr>
-        <w:t xml:space="preserve">Báo giá, Hợp đồng, Biên bản bàn giao,</w:t>
-      </w:r>
-      <w:r>
-        <w:rPr>
-          <w:b/>
-          <w:bCs/>
-        </w:rPr>
-        <w:t xml:space="preserve"> </w:t>
-      </w:r>
-      <w:r>
-        <w:rPr>
-          <w:b/>
-          <w:bCs/>
-        </w:rPr>
-        <w:t xml:space="preserve">Giấy đề nghị tạm ứng, Giấy đề nghị thanh toán</w:t>
+        <w:t xml:space="preserve">in được</w:t>
+      </w:r>
+      <w:r>
+        <w:t xml:space="preserve"> </w:t>
+      </w:r>
+      <w:r>
+        <w:rPr>
+          <w:b/>
+          <w:bCs/>
+        </w:rPr>
+        <w:t xml:space="preserve">Báo giá, Hợp đồng, Biên bản bàn giao, Giấy đề</w:t>
+      </w:r>
+      <w:r>
+        <w:rPr>
+          <w:b/>
+          <w:bCs/>
+        </w:rPr>
+        <w:t xml:space="preserve"> </w:t>
+      </w:r>
+      <w:r>
+        <w:rPr>
+          <w:b/>
+          <w:bCs/>
+        </w:rPr>
+        <w:t xml:space="preserve">nghị tạm ứng, Giấy đề nghị thanh toán</w:t>
       </w:r>
       <w:r>
         <w:t xml:space="preserve"> </w:t>
@@ -1507,7 +4236,21 @@
           <w:i/>
           <w:iCs/>
         </w:rPr>
-        <w:t xml:space="preserve">…, ngày … tháng … năm …</w:t>
+        <w:t xml:space="preserve">…, ngày</w:t>
+      </w:r>
+      <w:r>
+        <w:rPr>
+          <w:i/>
+          <w:iCs/>
+        </w:rPr>
+        <w:t xml:space="preserve"> </w:t>
+      </w:r>
+      <w:r>
+        <w:rPr>
+          <w:i/>
+          <w:iCs/>
+        </w:rPr>
+        <w:t xml:space="preserve">… tháng … năm …</w:t>
       </w:r>
       <w:r>
         <w:t xml:space="preserve">”</w:t>
@@ -1548,8 +4291,9 @@
         <w:t xml:space="preserve">.</w:t>
       </w:r>
     </w:p>
-    <w:bookmarkEnd w:id="37"/>
-    <w:bookmarkStart w:id="41" w:name="kế-hoạch-sản-xuất"/>
+    <w:bookmarkEnd w:id="79"/>
+    <w:bookmarkEnd w:id="80"/>
+    <w:bookmarkStart w:id="84" w:name="kế-hoạch-sản-xuất"/>
     <w:p>
       <w:pPr>
         <w:pStyle w:val="Heading1"/>
@@ -1634,18 +4378,18 @@
           <wp:inline>
             <wp:extent cx="5334000" cy="3426354"/>
             <wp:effectExtent b="0" l="0" r="0" t="0"/>
-            <wp:docPr descr="Kế hoạch sản xuất" title="" id="39" name="Picture"/>
+            <wp:docPr descr="Kế hoạch sản xuất" title="" id="82" name="Picture"/>
             <a:graphic>
               <a:graphicData uri="http://schemas.openxmlformats.org/drawingml/2006/picture">
                 <pic:pic>
                   <pic:nvPicPr>
-                    <pic:cNvPr descr="images/05-ke-hoach-sx/01-ke-hoach.png" id="40" name="Picture"/>
+                    <pic:cNvPr descr="images/05-ke-hoach-sx/01-ke-hoach.png" id="83" name="Picture"/>
                     <pic:cNvPicPr>
                       <a:picLocks noChangeArrowheads="1" noChangeAspect="1"/>
                     </pic:cNvPicPr>
                   </pic:nvPicPr>
                   <pic:blipFill>
-                    <a:blip r:embed="rId38"/>
+                    <a:blip r:embed="rId81"/>
                     <a:stretch>
                       <a:fillRect/>
                     </a:stretch>
@@ -1888,7 +4632,7 @@
         <w:pStyle w:val="Compact"/>
         <w:numPr>
           <w:ilvl w:val="0"/>
-          <w:numId w:val="1002"/>
+          <w:numId w:val="1001"/>
         </w:numPr>
       </w:pPr>
       <w:r>
@@ -1995,7 +4739,7 @@
         <w:pStyle w:val="Compact"/>
         <w:numPr>
           <w:ilvl w:val="0"/>
-          <w:numId w:val="1002"/>
+          <w:numId w:val="1001"/>
         </w:numPr>
       </w:pPr>
       <w:r>
@@ -2033,7 +4777,7 @@
         <w:pStyle w:val="Compact"/>
         <w:numPr>
           <w:ilvl w:val="0"/>
-          <w:numId w:val="1002"/>
+          <w:numId w:val="1001"/>
         </w:numPr>
       </w:pPr>
       <w:r>
@@ -2055,7 +4799,7 @@
         <w:pStyle w:val="Compact"/>
         <w:numPr>
           <w:ilvl w:val="0"/>
-          <w:numId w:val="1002"/>
+          <w:numId w:val="1001"/>
         </w:numPr>
       </w:pPr>
       <w:r>
@@ -2088,8 +4832,8 @@
         <w:t xml:space="preserve">đã thiết lập.</w:t>
       </w:r>
     </w:p>
-    <w:bookmarkEnd w:id="41"/>
-    <w:bookmarkStart w:id="57" w:name="nguyên-vật-liệu-master-data"/>
+    <w:bookmarkEnd w:id="84"/>
+    <w:bookmarkStart w:id="100" w:name="nguyên-vật-liệu-master-data"/>
     <w:p>
       <w:pPr>
         <w:pStyle w:val="Heading1"/>
@@ -2146,18 +4890,18 @@
           <wp:inline>
             <wp:extent cx="5334000" cy="3381904"/>
             <wp:effectExtent b="0" l="0" r="0" t="0"/>
-            <wp:docPr descr="Danh sách nguyên vật liệu" title="" id="43" name="Picture"/>
+            <wp:docPr descr="Danh sách nguyên vật liệu" title="" id="86" name="Picture"/>
             <a:graphic>
               <a:graphicData uri="http://schemas.openxmlformats.org/drawingml/2006/picture">
                 <pic:pic>
                   <pic:nvPicPr>
-                    <pic:cNvPr descr="images/06-nvl/01-danh-sach.png" id="44" name="Picture"/>
+                    <pic:cNvPr descr="images/06-nvl/01-danh-sach.png" id="87" name="Picture"/>
                     <pic:cNvPicPr>
                       <a:picLocks noChangeArrowheads="1" noChangeAspect="1"/>
                     </pic:cNvPicPr>
                   </pic:nvPicPr>
                   <pic:blipFill>
-                    <a:blip r:embed="rId42"/>
+                    <a:blip r:embed="rId85"/>
                     <a:stretch>
                       <a:fillRect/>
                     </a:stretch>
@@ -2219,18 +4963,18 @@
           <wp:inline>
             <wp:extent cx="5334000" cy="5208058"/>
             <wp:effectExtent b="0" l="0" r="0" t="0"/>
-            <wp:docPr descr="Chi tiết vật tư" title="" id="46" name="Picture"/>
+            <wp:docPr descr="Chi tiết vật tư" title="" id="89" name="Picture"/>
             <a:graphic>
               <a:graphicData uri="http://schemas.openxmlformats.org/drawingml/2006/picture">
                 <pic:pic>
                   <pic:nvPicPr>
-                    <pic:cNvPr descr="images/06-nvl/02-chi-tiet.png" id="47" name="Picture"/>
+                    <pic:cNvPr descr="images/06-nvl/02-chi-tiet.png" id="90" name="Picture"/>
                     <pic:cNvPicPr>
                       <a:picLocks noChangeArrowheads="1" noChangeAspect="1"/>
                     </pic:cNvPicPr>
                   </pic:nvPicPr>
                   <pic:blipFill>
-                    <a:blip r:embed="rId45"/>
+                    <a:blip r:embed="rId88"/>
                     <a:stretch>
                       <a:fillRect/>
                     </a:stretch>
@@ -2292,18 +5036,18 @@
           <wp:inline>
             <wp:extent cx="5334000" cy="3907895"/>
             <wp:effectExtent b="0" l="0" r="0" t="0"/>
-            <wp:docPr descr="Danh mục nguyên vật liệu" title="" id="49" name="Picture"/>
+            <wp:docPr descr="Danh mục nguyên vật liệu" title="" id="92" name="Picture"/>
             <a:graphic>
               <a:graphicData uri="http://schemas.openxmlformats.org/drawingml/2006/picture">
                 <pic:pic>
                   <pic:nvPicPr>
-                    <pic:cNvPr descr="images/06-nvl/03-danh-muc.png" id="50" name="Picture"/>
+                    <pic:cNvPr descr="images/06-nvl/03-danh-muc.png" id="93" name="Picture"/>
                     <pic:cNvPicPr>
                       <a:picLocks noChangeArrowheads="1" noChangeAspect="1"/>
                     </pic:cNvPicPr>
                   </pic:nvPicPr>
                   <pic:blipFill>
-                    <a:blip r:embed="rId48"/>
+                    <a:blip r:embed="rId91"/>
                     <a:stretch>
                       <a:fillRect/>
                     </a:stretch>
@@ -2365,18 +5109,18 @@
           <wp:inline>
             <wp:extent cx="5334000" cy="3907895"/>
             <wp:effectExtent b="0" l="0" r="0" t="0"/>
-            <wp:docPr descr="Đơn vị tính" title="" id="52" name="Picture"/>
+            <wp:docPr descr="Đơn vị tính" title="" id="95" name="Picture"/>
             <a:graphic>
               <a:graphicData uri="http://schemas.openxmlformats.org/drawingml/2006/picture">
                 <pic:pic>
                   <pic:nvPicPr>
-                    <pic:cNvPr descr="images/06-nvl/04-don-vi-tinh.png" id="53" name="Picture"/>
+                    <pic:cNvPr descr="images/06-nvl/04-don-vi-tinh.png" id="96" name="Picture"/>
                     <pic:cNvPicPr>
                       <a:picLocks noChangeArrowheads="1" noChangeAspect="1"/>
                     </pic:cNvPicPr>
                   </pic:nvPicPr>
                   <pic:blipFill>
-                    <a:blip r:embed="rId51"/>
+                    <a:blip r:embed="rId94"/>
                     <a:stretch>
                       <a:fillRect/>
                     </a:stretch>
@@ -2438,18 +5182,18 @@
           <wp:inline>
             <wp:extent cx="5334000" cy="3381904"/>
             <wp:effectExtent b="0" l="0" r="0" t="0"/>
-            <wp:docPr descr="Nhà cung cấp" title="" id="55" name="Picture"/>
+            <wp:docPr descr="Nhà cung cấp" title="" id="98" name="Picture"/>
             <a:graphic>
               <a:graphicData uri="http://schemas.openxmlformats.org/drawingml/2006/picture">
                 <pic:pic>
                   <pic:nvPicPr>
-                    <pic:cNvPr descr="images/06-nvl/05-nha-cung-cap.png" id="56" name="Picture"/>
+                    <pic:cNvPr descr="images/06-nvl/05-nha-cung-cap.png" id="99" name="Picture"/>
                     <pic:cNvPicPr>
                       <a:picLocks noChangeArrowheads="1" noChangeAspect="1"/>
                     </pic:cNvPicPr>
                   </pic:nvPicPr>
                   <pic:blipFill>
-                    <a:blip r:embed="rId54"/>
+                    <a:blip r:embed="rId97"/>
                     <a:stretch>
                       <a:fillRect/>
                     </a:stretch>
@@ -2484,8 +5228,8 @@
         <w:t xml:space="preserve">Nhà cung cấp</w:t>
       </w:r>
     </w:p>
-    <w:bookmarkEnd w:id="57"/>
-    <w:bookmarkStart w:id="61" w:name="tồn-kho-cảnh-báo-tồn-thấp"/>
+    <w:bookmarkEnd w:id="100"/>
+    <w:bookmarkStart w:id="104" w:name="tồn-kho-cảnh-báo-tồn-thấp"/>
     <w:p>
       <w:pPr>
         <w:pStyle w:val="Heading1"/>
@@ -2549,18 +5293,18 @@
           <wp:inline>
             <wp:extent cx="5334000" cy="3381904"/>
             <wp:effectExtent b="0" l="0" r="0" t="0"/>
-            <wp:docPr descr="Cảnh báo tồn kho thấp" title="" id="59" name="Picture"/>
+            <wp:docPr descr="Cảnh báo tồn kho thấp" title="" id="102" name="Picture"/>
             <a:graphic>
               <a:graphicData uri="http://schemas.openxmlformats.org/drawingml/2006/picture">
                 <pic:pic>
                   <pic:nvPicPr>
-                    <pic:cNvPr descr="images/07-ton-kho/01-canh-bao-ton-thap.png" id="60" name="Picture"/>
+                    <pic:cNvPr descr="images/07-ton-kho/01-canh-bao-ton-thap.png" id="103" name="Picture"/>
                     <pic:cNvPicPr>
                       <a:picLocks noChangeArrowheads="1" noChangeAspect="1"/>
                     </pic:cNvPicPr>
                   </pic:nvPicPr>
                   <pic:blipFill>
-                    <a:blip r:embed="rId58"/>
+                    <a:blip r:embed="rId101"/>
                     <a:stretch>
                       <a:fillRect/>
                     </a:stretch>
@@ -2595,8 +5339,8 @@
         <w:t xml:space="preserve">Cảnh báo tồn kho thấp</w:t>
       </w:r>
     </w:p>
-    <w:bookmarkEnd w:id="61"/>
-    <w:bookmarkStart w:id="93" w:name="vòng-cung-ứng-vật-tư-đề-xuất-pr-po-gr"/>
+    <w:bookmarkEnd w:id="104"/>
+    <w:bookmarkStart w:id="136" w:name="vòng-cung-ứng-vật-tư-đề-xuất-pr-po-gr"/>
     <w:p>
       <w:pPr>
         <w:pStyle w:val="Heading1"/>
@@ -2695,7 +5439,7 @@
         <w:t xml:space="preserve">→ tiếp tục sản xuất.</w:t>
       </w:r>
     </w:p>
-    <w:bookmarkStart w:id="65" w:name="đề-xuất-mua-hàng-tự-động"/>
+    <w:bookmarkStart w:id="108" w:name="đề-xuất-mua-hàng-tự-động"/>
     <w:p>
       <w:pPr>
         <w:pStyle w:val="Heading2"/>
@@ -2792,18 +5536,18 @@
           <wp:inline>
             <wp:extent cx="5334000" cy="3381904"/>
             <wp:effectExtent b="0" l="0" r="0" t="0"/>
-            <wp:docPr descr="Đề xuất mua hàng tự động" title="" id="63" name="Picture"/>
+            <wp:docPr descr="Đề xuất mua hàng tự động" title="" id="106" name="Picture"/>
             <a:graphic>
               <a:graphicData uri="http://schemas.openxmlformats.org/drawingml/2006/picture">
                 <pic:pic>
                   <pic:nvPicPr>
-                    <pic:cNvPr descr="images/08-de-xuat/01-de-xuat-tu-dong.png" id="64" name="Picture"/>
+                    <pic:cNvPr descr="images/08-de-xuat/01-de-xuat-tu-dong.png" id="107" name="Picture"/>
                     <pic:cNvPicPr>
                       <a:picLocks noChangeArrowheads="1" noChangeAspect="1"/>
                     </pic:cNvPicPr>
                   </pic:nvPicPr>
                   <pic:blipFill>
-                    <a:blip r:embed="rId62"/>
+                    <a:blip r:embed="rId105"/>
                     <a:stretch>
                       <a:fillRect/>
                     </a:stretch>
@@ -2838,8 +5582,8 @@
         <w:t xml:space="preserve">Đề xuất mua hàng tự động</w:t>
       </w:r>
     </w:p>
-    <w:bookmarkEnd w:id="65"/>
-    <w:bookmarkStart w:id="75" w:name="đề-nghị-mua-hàng-pr"/>
+    <w:bookmarkEnd w:id="108"/>
+    <w:bookmarkStart w:id="118" w:name="đề-nghị-mua-hàng-pr"/>
     <w:p>
       <w:pPr>
         <w:pStyle w:val="Heading2"/>
@@ -2934,18 +5678,18 @@
           <wp:inline>
             <wp:extent cx="5334000" cy="3381904"/>
             <wp:effectExtent b="0" l="0" r="0" t="0"/>
-            <wp:docPr descr="Danh sách đề nghị mua" title="" id="67" name="Picture"/>
+            <wp:docPr descr="Danh sách đề nghị mua" title="" id="110" name="Picture"/>
             <a:graphic>
               <a:graphicData uri="http://schemas.openxmlformats.org/drawingml/2006/picture">
                 <pic:pic>
                   <pic:nvPicPr>
-                    <pic:cNvPr descr="images/09-de-nghi-mua/01-danh-sach.png" id="68" name="Picture"/>
+                    <pic:cNvPr descr="images/09-de-nghi-mua/01-danh-sach.png" id="111" name="Picture"/>
                     <pic:cNvPicPr>
                       <a:picLocks noChangeArrowheads="1" noChangeAspect="1"/>
                     </pic:cNvPicPr>
                   </pic:nvPicPr>
                   <pic:blipFill>
-                    <a:blip r:embed="rId66"/>
+                    <a:blip r:embed="rId109"/>
                     <a:stretch>
                       <a:fillRect/>
                     </a:stretch>
@@ -3049,18 +5793,18 @@
           <wp:inline>
             <wp:extent cx="5334000" cy="3381904"/>
             <wp:effectExtent b="0" l="0" r="0" t="0"/>
-            <wp:docPr descr="Biểu mẫu tạo đề nghị mua" title="" id="70" name="Picture"/>
+            <wp:docPr descr="Biểu mẫu tạo đề nghị mua" title="" id="113" name="Picture"/>
             <a:graphic>
               <a:graphicData uri="http://schemas.openxmlformats.org/drawingml/2006/picture">
                 <pic:pic>
                   <pic:nvPicPr>
-                    <pic:cNvPr descr="images/09-de-nghi-mua/02-form-tao.png" id="71" name="Picture"/>
+                    <pic:cNvPr descr="images/09-de-nghi-mua/02-form-tao.png" id="114" name="Picture"/>
                     <pic:cNvPicPr>
                       <a:picLocks noChangeArrowheads="1" noChangeAspect="1"/>
                     </pic:cNvPicPr>
                   </pic:nvPicPr>
                   <pic:blipFill>
-                    <a:blip r:embed="rId69"/>
+                    <a:blip r:embed="rId112"/>
                     <a:stretch>
                       <a:fillRect/>
                     </a:stretch>
@@ -3280,18 +6024,18 @@
           <wp:inline>
             <wp:extent cx="5334000" cy="3381904"/>
             <wp:effectExtent b="0" l="0" r="0" t="0"/>
-            <wp:docPr descr="Chi tiết đề nghị mua" title="" id="73" name="Picture"/>
+            <wp:docPr descr="Chi tiết đề nghị mua" title="" id="116" name="Picture"/>
             <a:graphic>
               <a:graphicData uri="http://schemas.openxmlformats.org/drawingml/2006/picture">
                 <pic:pic>
                   <pic:nvPicPr>
-                    <pic:cNvPr descr="images/09-de-nghi-mua/03-chi-tiet.png" id="74" name="Picture"/>
+                    <pic:cNvPr descr="images/09-de-nghi-mua/03-chi-tiet.png" id="117" name="Picture"/>
                     <pic:cNvPicPr>
                       <a:picLocks noChangeArrowheads="1" noChangeAspect="1"/>
                     </pic:cNvPicPr>
                   </pic:nvPicPr>
                   <pic:blipFill>
-                    <a:blip r:embed="rId72"/>
+                    <a:blip r:embed="rId115"/>
                     <a:stretch>
                       <a:fillRect/>
                     </a:stretch>
@@ -3326,8 +6070,8 @@
         <w:t xml:space="preserve">Chi tiết đề nghị mua</w:t>
       </w:r>
     </w:p>
-    <w:bookmarkEnd w:id="75"/>
-    <w:bookmarkStart w:id="85" w:name="đơn-mua-hàng-po"/>
+    <w:bookmarkEnd w:id="118"/>
+    <w:bookmarkStart w:id="128" w:name="đơn-mua-hàng-po"/>
     <w:p>
       <w:pPr>
         <w:pStyle w:val="Heading2"/>
@@ -3429,18 +6173,18 @@
           <wp:inline>
             <wp:extent cx="5334000" cy="3381904"/>
             <wp:effectExtent b="0" l="0" r="0" t="0"/>
-            <wp:docPr descr="Danh sách đơn mua" title="" id="77" name="Picture"/>
+            <wp:docPr descr="Danh sách đơn mua" title="" id="120" name="Picture"/>
             <a:graphic>
               <a:graphicData uri="http://schemas.openxmlformats.org/drawingml/2006/picture">
                 <pic:pic>
                   <pic:nvPicPr>
-                    <pic:cNvPr descr="images/10-don-mua/01-danh-sach.png" id="78" name="Picture"/>
+                    <pic:cNvPr descr="images/10-don-mua/01-danh-sach.png" id="121" name="Picture"/>
                     <pic:cNvPicPr>
                       <a:picLocks noChangeArrowheads="1" noChangeAspect="1"/>
                     </pic:cNvPicPr>
                   </pic:nvPicPr>
                   <pic:blipFill>
-                    <a:blip r:embed="rId76"/>
+                    <a:blip r:embed="rId119"/>
                     <a:stretch>
                       <a:fillRect/>
                     </a:stretch>
@@ -3571,18 +6315,18 @@
           <wp:inline>
             <wp:extent cx="5334000" cy="3381904"/>
             <wp:effectExtent b="0" l="0" r="0" t="0"/>
-            <wp:docPr descr="Biểu mẫu tạo đơn mua" title="" id="80" name="Picture"/>
+            <wp:docPr descr="Biểu mẫu tạo đơn mua" title="" id="123" name="Picture"/>
             <a:graphic>
               <a:graphicData uri="http://schemas.openxmlformats.org/drawingml/2006/picture">
                 <pic:pic>
                   <pic:nvPicPr>
-                    <pic:cNvPr descr="images/10-don-mua/02-form-tao.png" id="81" name="Picture"/>
+                    <pic:cNvPr descr="images/10-don-mua/02-form-tao.png" id="124" name="Picture"/>
                     <pic:cNvPicPr>
                       <a:picLocks noChangeArrowheads="1" noChangeAspect="1"/>
                     </pic:cNvPicPr>
                   </pic:nvPicPr>
                   <pic:blipFill>
-                    <a:blip r:embed="rId79"/>
+                    <a:blip r:embed="rId122"/>
                     <a:stretch>
                       <a:fillRect/>
                     </a:stretch>
@@ -3706,18 +6450,18 @@
           <wp:inline>
             <wp:extent cx="5334000" cy="4248679"/>
             <wp:effectExtent b="0" l="0" r="0" t="0"/>
-            <wp:docPr descr="Chi tiết đơn mua" title="" id="83" name="Picture"/>
+            <wp:docPr descr="Chi tiết đơn mua" title="" id="126" name="Picture"/>
             <a:graphic>
               <a:graphicData uri="http://schemas.openxmlformats.org/drawingml/2006/picture">
                 <pic:pic>
                   <pic:nvPicPr>
-                    <pic:cNvPr descr="images/10-don-mua/03-chi-tiet.png" id="84" name="Picture"/>
+                    <pic:cNvPr descr="images/10-don-mua/03-chi-tiet.png" id="127" name="Picture"/>
                     <pic:cNvPicPr>
                       <a:picLocks noChangeArrowheads="1" noChangeAspect="1"/>
                     </pic:cNvPicPr>
                   </pic:nvPicPr>
                   <pic:blipFill>
-                    <a:blip r:embed="rId82"/>
+                    <a:blip r:embed="rId125"/>
                     <a:stretch>
                       <a:fillRect/>
                     </a:stretch>
@@ -3752,8 +6496,8 @@
         <w:t xml:space="preserve">Chi tiết đơn mua</w:t>
       </w:r>
     </w:p>
-    <w:bookmarkEnd w:id="85"/>
-    <w:bookmarkStart w:id="92" w:name="nhập-kho-gr"/>
+    <w:bookmarkEnd w:id="128"/>
+    <w:bookmarkStart w:id="135" w:name="nhập-kho-gr"/>
     <w:p>
       <w:pPr>
         <w:pStyle w:val="Heading2"/>
@@ -3813,7 +6557,7 @@
         <w:pStyle w:val="Compact"/>
         <w:numPr>
           <w:ilvl w:val="0"/>
-          <w:numId w:val="1003"/>
+          <w:numId w:val="1002"/>
         </w:numPr>
       </w:pPr>
       <w:r>
@@ -3854,7 +6598,7 @@
         <w:pStyle w:val="Compact"/>
         <w:numPr>
           <w:ilvl w:val="0"/>
-          <w:numId w:val="1003"/>
+          <w:numId w:val="1002"/>
         </w:numPr>
       </w:pPr>
       <w:r>
@@ -3892,7 +6636,7 @@
         <w:pStyle w:val="Compact"/>
         <w:numPr>
           <w:ilvl w:val="0"/>
-          <w:numId w:val="1003"/>
+          <w:numId w:val="1002"/>
         </w:numPr>
       </w:pPr>
       <w:r>
@@ -3965,18 +6709,18 @@
           <wp:inline>
             <wp:extent cx="5334000" cy="3381904"/>
             <wp:effectExtent b="0" l="0" r="0" t="0"/>
-            <wp:docPr descr="Danh sách phiếu nhập kho" title="" id="87" name="Picture"/>
+            <wp:docPr descr="Danh sách phiếu nhập kho" title="" id="130" name="Picture"/>
             <a:graphic>
               <a:graphicData uri="http://schemas.openxmlformats.org/drawingml/2006/picture">
                 <pic:pic>
                   <pic:nvPicPr>
-                    <pic:cNvPr descr="images/11-nhap-kho/01-danh-sach.png" id="88" name="Picture"/>
+                    <pic:cNvPr descr="images/11-nhap-kho/01-danh-sach.png" id="131" name="Picture"/>
                     <pic:cNvPicPr>
                       <a:picLocks noChangeArrowheads="1" noChangeAspect="1"/>
                     </pic:cNvPicPr>
                   </pic:nvPicPr>
                   <pic:blipFill>
-                    <a:blip r:embed="rId86"/>
+                    <a:blip r:embed="rId129"/>
                     <a:stretch>
                       <a:fillRect/>
                     </a:stretch>
@@ -4044,18 +6788,18 @@
           <wp:inline>
             <wp:extent cx="5334000" cy="3381904"/>
             <wp:effectExtent b="0" l="0" r="0" t="0"/>
-            <wp:docPr descr="Chi tiết phiếu nhập kho" title="" id="90" name="Picture"/>
+            <wp:docPr descr="Chi tiết phiếu nhập kho" title="" id="133" name="Picture"/>
             <a:graphic>
               <a:graphicData uri="http://schemas.openxmlformats.org/drawingml/2006/picture">
                 <pic:pic>
                   <pic:nvPicPr>
-                    <pic:cNvPr descr="images/11-nhap-kho/02-chi-tiet.png" id="91" name="Picture"/>
+                    <pic:cNvPr descr="images/11-nhap-kho/02-chi-tiet.png" id="134" name="Picture"/>
                     <pic:cNvPicPr>
                       <a:picLocks noChangeArrowheads="1" noChangeAspect="1"/>
                     </pic:cNvPicPr>
                   </pic:nvPicPr>
                   <pic:blipFill>
-                    <a:blip r:embed="rId89"/>
+                    <a:blip r:embed="rId132"/>
                     <a:stretch>
                       <a:fillRect/>
                     </a:stretch>
@@ -4090,9 +6834,9 @@
         <w:t xml:space="preserve">Chi tiết phiếu nhập kho</w:t>
       </w:r>
     </w:p>
-    <w:bookmarkEnd w:id="92"/>
-    <w:bookmarkEnd w:id="93"/>
-    <w:bookmarkStart w:id="100" w:name="cài-đặt"/>
+    <w:bookmarkEnd w:id="135"/>
+    <w:bookmarkEnd w:id="136"/>
+    <w:bookmarkStart w:id="143" w:name="cài-đặt"/>
     <w:p>
       <w:pPr>
         <w:pStyle w:val="Heading1"/>
@@ -4144,18 +6888,18 @@
           <wp:inline>
             <wp:extent cx="5334000" cy="6441545"/>
             <wp:effectExtent b="0" l="0" r="0" t="0"/>
-            <wp:docPr descr="Cài đặt thông tin công ty" title="" id="95" name="Picture"/>
+            <wp:docPr descr="Cài đặt thông tin công ty" title="" id="138" name="Picture"/>
             <a:graphic>
               <a:graphicData uri="http://schemas.openxmlformats.org/drawingml/2006/picture">
                 <pic:pic>
                   <pic:nvPicPr>
-                    <pic:cNvPr descr="images/12-cai-dat/01-thong-tin-cong-ty.png" id="96" name="Picture"/>
+                    <pic:cNvPr descr="images/12-cai-dat/01-thong-tin-cong-ty.png" id="139" name="Picture"/>
                     <pic:cNvPicPr>
                       <a:picLocks noChangeArrowheads="1" noChangeAspect="1"/>
                     </pic:cNvPicPr>
                   </pic:nvPicPr>
                   <pic:blipFill>
-                    <a:blip r:embed="rId94"/>
+                    <a:blip r:embed="rId137"/>
                     <a:stretch>
                       <a:fillRect/>
                     </a:stretch>
@@ -4242,18 +6986,18 @@
           <wp:inline>
             <wp:extent cx="5334000" cy="4307945"/>
             <wp:effectExtent b="0" l="0" r="0" t="0"/>
-            <wp:docPr descr="Cấu hình trường mở rộng" title="" id="98" name="Picture"/>
+            <wp:docPr descr="Cấu hình trường mở rộng" title="" id="141" name="Picture"/>
             <a:graphic>
               <a:graphicData uri="http://schemas.openxmlformats.org/drawingml/2006/picture">
                 <pic:pic>
                   <pic:nvPicPr>
-                    <pic:cNvPr descr="images/12-cai-dat/02-truong-mo-rong.png" id="99" name="Picture"/>
+                    <pic:cNvPr descr="images/12-cai-dat/02-truong-mo-rong.png" id="142" name="Picture"/>
                     <pic:cNvPicPr>
                       <a:picLocks noChangeArrowheads="1" noChangeAspect="1"/>
                     </pic:cNvPicPr>
                   </pic:nvPicPr>
                   <pic:blipFill>
-                    <a:blip r:embed="rId97"/>
+                    <a:blip r:embed="rId140"/>
                     <a:stretch>
                       <a:fillRect/>
                     </a:stretch>
@@ -4288,8 +7032,8 @@
         <w:t xml:space="preserve">Cấu hình trường mở rộng</w:t>
       </w:r>
     </w:p>
-    <w:bookmarkEnd w:id="100"/>
-    <w:bookmarkStart w:id="101" w:name="phụ-lục-tóm-tắt-vòng-vận-hành"/>
+    <w:bookmarkEnd w:id="143"/>
+    <w:bookmarkStart w:id="144" w:name="phụ-lục-tóm-tắt-vòng-vận-hành"/>
     <w:p>
       <w:pPr>
         <w:pStyle w:val="Heading1"/>
@@ -4429,7 +7173,7 @@
         <w:t xml:space="preserve">— Hết —</w:t>
       </w:r>
     </w:p>
-    <w:bookmarkEnd w:id="101"/>
+    <w:bookmarkEnd w:id="144"/>
     <w:sectPr>
       <w:footnotePr>
         <w:numRestart w:val="eachSect"/>
@@ -4540,91 +7284,6 @@
       </w:pPr>
     </w:lvl>
   </w:abstractNum>
-  <w:abstractNum w:abstractNumId="99411">
-    <w:nsid w:val="00A99411"/>
-    <w:multiLevelType w:val="multilevel"/>
-    <w:lvl w:ilvl="0">
-      <w:start w:val="1"/>
-      <w:numFmt w:val="decimal"/>
-      <w:lvlText w:val="%1."/>
-      <w:lvlJc w:val="left"/>
-      <w:pPr>
-        <w:ind w:left="720" w:hanging="360"/>
-      </w:pPr>
-    </w:lvl>
-    <w:lvl w:ilvl="1">
-      <w:start w:val="1"/>
-      <w:numFmt w:val="decimal"/>
-      <w:lvlText w:val="%2."/>
-      <w:lvlJc w:val="left"/>
-      <w:pPr>
-        <w:ind w:left="1440" w:hanging="360"/>
-      </w:pPr>
-    </w:lvl>
-    <w:lvl w:ilvl="2">
-      <w:start w:val="1"/>
-      <w:numFmt w:val="decimal"/>
-      <w:lvlText w:val="%3."/>
-      <w:lvlJc w:val="left"/>
-      <w:pPr>
-        <w:ind w:left="2160" w:hanging="360"/>
-      </w:pPr>
-    </w:lvl>
-    <w:lvl w:ilvl="3">
-      <w:start w:val="1"/>
-      <w:numFmt w:val="decimal"/>
-      <w:lvlText w:val="%4."/>
-      <w:lvlJc w:val="left"/>
-      <w:pPr>
-        <w:ind w:left="2880" w:hanging="360"/>
-      </w:pPr>
-    </w:lvl>
-    <w:lvl w:ilvl="4">
-      <w:start w:val="1"/>
-      <w:numFmt w:val="decimal"/>
-      <w:lvlText w:val="%5."/>
-      <w:lvlJc w:val="left"/>
-      <w:pPr>
-        <w:ind w:left="3600" w:hanging="360"/>
-      </w:pPr>
-    </w:lvl>
-    <w:lvl w:ilvl="5">
-      <w:start w:val="1"/>
-      <w:numFmt w:val="decimal"/>
-      <w:lvlText w:val="%6."/>
-      <w:lvlJc w:val="left"/>
-      <w:pPr>
-        <w:ind w:left="4320" w:hanging="360"/>
-      </w:pPr>
-    </w:lvl>
-    <w:lvl w:ilvl="6">
-      <w:start w:val="1"/>
-      <w:numFmt w:val="decimal"/>
-      <w:lvlText w:val="%7."/>
-      <w:lvlJc w:val="left"/>
-      <w:pPr>
-        <w:ind w:left="5040" w:hanging="360"/>
-      </w:pPr>
-    </w:lvl>
-    <w:lvl w:ilvl="7">
-      <w:start w:val="1"/>
-      <w:numFmt w:val="decimal"/>
-      <w:lvlText w:val="%8."/>
-      <w:lvlJc w:val="left"/>
-      <w:pPr>
-        <w:ind w:left="5760" w:hanging="360"/>
-      </w:pPr>
-    </w:lvl>
-    <w:lvl w:ilvl="8">
-      <w:start w:val="1"/>
-      <w:numFmt w:val="decimal"/>
-      <w:lvlText w:val="%9."/>
-      <w:lvlJc w:val="left"/>
-      <w:pPr>
-        <w:ind w:left="6480" w:hanging="360"/>
-      </w:pPr>
-    </w:lvl>
-  </w:abstractNum>
   <w:abstractNum w:abstractNumId="991">
     <w:nsid w:val="0000A991"/>
     <w:multiLevelType w:val="multilevel"/>
@@ -4732,39 +7391,9 @@
     <w:abstractNumId w:val="990"/>
   </w:num>
   <w:num w:numId="1001">
-    <w:abstractNumId w:val="99411"/>
-    <w:lvlOverride w:ilvl="0">
-      <w:startOverride w:val="1"/>
-    </w:lvlOverride>
-    <w:lvlOverride w:ilvl="1">
-      <w:startOverride w:val="1"/>
-    </w:lvlOverride>
-    <w:lvlOverride w:ilvl="2">
-      <w:startOverride w:val="1"/>
-    </w:lvlOverride>
-    <w:lvlOverride w:ilvl="3">
-      <w:startOverride w:val="1"/>
-    </w:lvlOverride>
-    <w:lvlOverride w:ilvl="4">
-      <w:startOverride w:val="1"/>
-    </w:lvlOverride>
-    <w:lvlOverride w:ilvl="5">
-      <w:startOverride w:val="1"/>
-    </w:lvlOverride>
-    <w:lvlOverride w:ilvl="6">
-      <w:startOverride w:val="1"/>
-    </w:lvlOverride>
-    <w:lvlOverride w:ilvl="7">
-      <w:startOverride w:val="1"/>
-    </w:lvlOverride>
-    <w:lvlOverride w:ilvl="8">
-      <w:startOverride w:val="1"/>
-    </w:lvlOverride>
+    <w:abstractNumId w:val="991"/>
   </w:num>
   <w:num w:numId="1002">
-    <w:abstractNumId w:val="991"/>
-  </w:num>
-  <w:num w:numId="1003">
     <w:abstractNumId w:val="991"/>
   </w:num>
 </w:numbering>

</xml_diff>